<commit_message>
docs(baic): expand the English manuscript to four pages
The congress file now includes the ranking table and the positive-control
arm roles from the Persian manuscript. It stays inside the four-page limit.
</commit_message>
<xml_diff>
--- a/paper/baic/BAIC2026_Jamei_en.docx
+++ b/paper/baic/BAIC2026_Jamei_en.docx
@@ -626,6 +626,787 @@
           <w:szCs w:val="24"/>
           <w:lang w:val="en-US" w:bidi="en-US"/>
         </w:rPr>
+        <w:t>Labels are not grades</w:t>
+      </w:r>
+    </w:p>
+    <w:p>
+      <w:pPr>
+        <w:bidi w:val="0"/>
+        <w:jc w:val="both"/>
+      </w:pPr>
+      <w:r>
+        <w:rPr>
+          <w:rFonts w:ascii="Times New Roman" w:hAnsi="Times New Roman" w:cs="Times New Roman" w:eastAsia="Times New Roman"/>
+          <w:b w:val="0"/>
+          <w:i w:val="0"/>
+          <w:sz w:val="20"/>
+          <w:szCs w:val="20"/>
+          <w:lang w:val="en-US" w:bidi="en-US"/>
+        </w:rPr>
+        <w:t>Regulatory words on this port are labels, not grades. ASME VVUQ 40.1-2026 is a worked tibial-tray example, not a pass bit [8]. IEC 62304 assigns software safety class A, B, or C [9]. The International Medical Device Regulators Forum (IMDRF) fixes the wording for software in a medical device and for software as a medical device [10]. Recording that wording does not classify a product. If the model is not declared physics-based, the 2023 guidance places a standalone model outside that scope, and the note still does not raise the ladder.</w:t>
+      </w:r>
+    </w:p>
+    <w:p>
+      <w:pPr>
+        <w:bidi w:val="0"/>
+        <w:jc w:val="both"/>
+      </w:pPr>
+      <w:r>
+        <w:rPr>
+          <w:rFonts w:ascii="Times New Roman" w:hAnsi="Times New Roman" w:cs="Times New Roman" w:eastAsia="Times New Roman"/>
+          <w:b w:val="0"/>
+          <w:i w:val="0"/>
+          <w:sz w:val="20"/>
+          <w:szCs w:val="20"/>
+          <w:lang w:val="en-US" w:bidi="en-US"/>
+        </w:rPr>
+        <w:t>Phenomenon rank is taken from the nuclear-safety table: importance against knowledge [11]. High importance stays open unless knowledge is adequate and the row was measured. Medium importance is a gap only when knowledge is none. Low importance is screened out. A typed word, without a treatment arm, is not a measurement and does not close a high-importance gap. Table 2 is that rule. The cap on the weakest submodel follows the building-block rule [3]. A submodel that is not identifiable cannot contribute above 1. Evidence limited to calibration, plausibility, or emergent behavior, categories 2, 6, and 7 of the 2023 guidance, cannot contribute above 2. If a submodel was not executed, that cap is not reported as a measurement and does not move the claim grade.</w:t>
+      </w:r>
+    </w:p>
+    <w:p>
+      <w:pPr>
+        <w:pStyle w:val="Caption"/>
+        <w:keepNext/>
+        <w:bidi w:val="0"/>
+        <w:jc w:val="center"/>
+      </w:pPr>
+      <w:r>
+        <w:rPr>
+          <w:rFonts w:ascii="Times New Roman" w:hAnsi="Times New Roman" w:cs="Times New Roman" w:eastAsia="Times New Roman"/>
+          <w:b/>
+          <w:i w:val="0"/>
+          <w:sz w:val="16"/>
+          <w:szCs w:val="16"/>
+          <w:lang w:val="en-US" w:bidi="en-US"/>
+        </w:rPr>
+        <w:t>Table 2. Ranking gap. A typed word is not a measurement</w:t>
+      </w:r>
+    </w:p>
+    <w:tbl>
+      <w:tblPr>
+        <w:tblW w:type="auto" w:w="0"/>
+        <w:jc w:val="center"/>
+        <w:tblLayout w:type="fixed"/>
+        <w:tblLook w:firstColumn="1" w:firstRow="1" w:lastColumn="0" w:lastRow="0" w:noHBand="0" w:noVBand="1" w:val="04A0"/>
+        <w:tblBorders>
+          <w:top w:val="single" w:sz="4" w:space="0" w:color="000000"/>
+          <w:left w:val="single" w:sz="4" w:space="0" w:color="000000"/>
+          <w:bottom w:val="single" w:sz="4" w:space="0" w:color="000000"/>
+          <w:right w:val="single" w:sz="4" w:space="0" w:color="000000"/>
+          <w:insideH w:val="single" w:sz="4" w:space="0" w:color="000000"/>
+          <w:insideV w:val="single" w:sz="4" w:space="0" w:color="000000"/>
+        </w:tblBorders>
+        <w:tblW w:w="4600" w:type="dxa"/>
+        <w:tblLayout w:type="fixed"/>
+      </w:tblPr>
+      <w:tblGrid>
+        <w:gridCol w:w="1000"/>
+        <w:gridCol w:w="1300"/>
+        <w:gridCol w:w="1100"/>
+        <w:gridCol w:w="1200"/>
+      </w:tblGrid>
+      <w:tr>
+        <w:tc>
+          <w:tcPr>
+            <w:tcW w:type="dxa" w:w="1000"/>
+          </w:tcPr>
+          <w:p>
+            <w:pPr>
+              <w:bidi w:val="0"/>
+              <w:jc w:val="center"/>
+              <w:ind w:left="0" w:right="0" w:firstLine="0" w:hanging="0"/>
+            </w:pPr>
+            <w:r/>
+            <w:r>
+              <w:rPr>
+                <w:rFonts w:ascii="Times New Roman" w:hAnsi="Times New Roman" w:cs="Times New Roman" w:eastAsia="Times New Roman"/>
+                <w:b/>
+                <w:i w:val="0"/>
+                <w:sz w:val="16"/>
+                <w:szCs w:val="16"/>
+                <w:lang w:val="en-US" w:bidi="en-US"/>
+              </w:rPr>
+              <w:t>Importance</w:t>
+            </w:r>
+          </w:p>
+        </w:tc>
+        <w:tc>
+          <w:tcPr>
+            <w:tcW w:type="dxa" w:w="1300"/>
+          </w:tcPr>
+          <w:p>
+            <w:pPr>
+              <w:bidi w:val="0"/>
+              <w:jc w:val="center"/>
+              <w:ind w:left="0" w:right="0" w:firstLine="0" w:hanging="0"/>
+            </w:pPr>
+            <w:r/>
+            <w:r>
+              <w:rPr>
+                <w:rFonts w:ascii="Times New Roman" w:hAnsi="Times New Roman" w:cs="Times New Roman" w:eastAsia="Times New Roman"/>
+                <w:b/>
+                <w:i w:val="0"/>
+                <w:sz w:val="16"/>
+                <w:szCs w:val="16"/>
+                <w:lang w:val="en-US" w:bidi="en-US"/>
+              </w:rPr>
+              <w:t>Knowledge</w:t>
+            </w:r>
+          </w:p>
+        </w:tc>
+        <w:tc>
+          <w:tcPr>
+            <w:tcW w:type="dxa" w:w="1100"/>
+          </w:tcPr>
+          <w:p>
+            <w:pPr>
+              <w:bidi w:val="0"/>
+              <w:jc w:val="center"/>
+              <w:ind w:left="0" w:right="0" w:firstLine="0" w:hanging="0"/>
+            </w:pPr>
+            <w:r/>
+            <w:r>
+              <w:rPr>
+                <w:rFonts w:ascii="Times New Roman" w:hAnsi="Times New Roman" w:cs="Times New Roman" w:eastAsia="Times New Roman"/>
+                <w:b/>
+                <w:i w:val="0"/>
+                <w:sz w:val="16"/>
+                <w:szCs w:val="16"/>
+                <w:lang w:val="en-US" w:bidi="en-US"/>
+              </w:rPr>
+              <w:t>Measured</w:t>
+            </w:r>
+          </w:p>
+        </w:tc>
+        <w:tc>
+          <w:tcPr>
+            <w:tcW w:type="dxa" w:w="1200"/>
+          </w:tcPr>
+          <w:p>
+            <w:pPr>
+              <w:bidi w:val="0"/>
+              <w:jc w:val="center"/>
+              <w:ind w:left="0" w:right="0" w:firstLine="0" w:hanging="0"/>
+            </w:pPr>
+            <w:r/>
+            <w:r>
+              <w:rPr>
+                <w:rFonts w:ascii="Times New Roman" w:hAnsi="Times New Roman" w:cs="Times New Roman" w:eastAsia="Times New Roman"/>
+                <w:b/>
+                <w:i w:val="0"/>
+                <w:sz w:val="16"/>
+                <w:szCs w:val="16"/>
+                <w:lang w:val="en-US" w:bidi="en-US"/>
+              </w:rPr>
+              <w:t>Gap</w:t>
+            </w:r>
+          </w:p>
+        </w:tc>
+      </w:tr>
+      <w:tr>
+        <w:tc>
+          <w:tcPr>
+            <w:tcW w:type="dxa" w:w="1000"/>
+          </w:tcPr>
+          <w:p>
+            <w:pPr>
+              <w:bidi w:val="0"/>
+              <w:jc w:val="both"/>
+              <w:ind w:left="0" w:right="0" w:firstLine="0" w:hanging="0"/>
+            </w:pPr>
+            <w:r/>
+            <w:r>
+              <w:rPr>
+                <w:rFonts w:ascii="Times New Roman" w:hAnsi="Times New Roman" w:cs="Times New Roman" w:eastAsia="Times New Roman"/>
+                <w:b w:val="0"/>
+                <w:i w:val="0"/>
+                <w:sz w:val="16"/>
+                <w:szCs w:val="16"/>
+                <w:lang w:val="en-US" w:bidi="en-US"/>
+              </w:rPr>
+              <w:t>High</w:t>
+            </w:r>
+          </w:p>
+        </w:tc>
+        <w:tc>
+          <w:tcPr>
+            <w:tcW w:type="dxa" w:w="1300"/>
+          </w:tcPr>
+          <w:p>
+            <w:pPr>
+              <w:bidi w:val="0"/>
+              <w:jc w:val="both"/>
+              <w:ind w:left="0" w:right="0" w:firstLine="0" w:hanging="0"/>
+            </w:pPr>
+            <w:r/>
+            <w:r>
+              <w:rPr>
+                <w:rFonts w:ascii="Times New Roman" w:hAnsi="Times New Roman" w:cs="Times New Roman" w:eastAsia="Times New Roman"/>
+                <w:b w:val="0"/>
+                <w:i w:val="0"/>
+                <w:sz w:val="16"/>
+                <w:szCs w:val="16"/>
+                <w:lang w:val="en-US" w:bidi="en-US"/>
+              </w:rPr>
+              <w:t>None or partial</w:t>
+            </w:r>
+          </w:p>
+        </w:tc>
+        <w:tc>
+          <w:tcPr>
+            <w:tcW w:type="dxa" w:w="1100"/>
+          </w:tcPr>
+          <w:p>
+            <w:pPr>
+              <w:bidi w:val="0"/>
+              <w:jc w:val="both"/>
+              <w:ind w:left="0" w:right="0" w:firstLine="0" w:hanging="0"/>
+            </w:pPr>
+            <w:r/>
+            <w:r>
+              <w:rPr>
+                <w:rFonts w:ascii="Times New Roman" w:hAnsi="Times New Roman" w:cs="Times New Roman" w:eastAsia="Times New Roman"/>
+                <w:b w:val="0"/>
+                <w:i w:val="0"/>
+                <w:sz w:val="16"/>
+                <w:szCs w:val="16"/>
+                <w:lang w:val="en-US" w:bidi="en-US"/>
+              </w:rPr>
+              <w:t>Either</w:t>
+            </w:r>
+          </w:p>
+        </w:tc>
+        <w:tc>
+          <w:tcPr>
+            <w:tcW w:type="dxa" w:w="1200"/>
+          </w:tcPr>
+          <w:p>
+            <w:pPr>
+              <w:bidi w:val="0"/>
+              <w:jc w:val="both"/>
+              <w:ind w:left="0" w:right="0" w:firstLine="0" w:hanging="0"/>
+            </w:pPr>
+            <w:r/>
+            <w:r>
+              <w:rPr>
+                <w:rFonts w:ascii="Times New Roman" w:hAnsi="Times New Roman" w:cs="Times New Roman" w:eastAsia="Times New Roman"/>
+                <w:b w:val="0"/>
+                <w:i w:val="0"/>
+                <w:sz w:val="16"/>
+                <w:szCs w:val="16"/>
+                <w:lang w:val="en-US" w:bidi="en-US"/>
+              </w:rPr>
+              <w:t>Open</w:t>
+            </w:r>
+          </w:p>
+        </w:tc>
+      </w:tr>
+      <w:tr>
+        <w:tc>
+          <w:tcPr>
+            <w:tcW w:type="dxa" w:w="1000"/>
+          </w:tcPr>
+          <w:p>
+            <w:pPr>
+              <w:bidi w:val="0"/>
+              <w:jc w:val="both"/>
+              <w:ind w:left="0" w:right="0" w:firstLine="0" w:hanging="0"/>
+            </w:pPr>
+            <w:r/>
+            <w:r>
+              <w:rPr>
+                <w:rFonts w:ascii="Times New Roman" w:hAnsi="Times New Roman" w:cs="Times New Roman" w:eastAsia="Times New Roman"/>
+                <w:b w:val="0"/>
+                <w:i w:val="0"/>
+                <w:sz w:val="16"/>
+                <w:szCs w:val="16"/>
+                <w:lang w:val="en-US" w:bidi="en-US"/>
+              </w:rPr>
+              <w:t>High</w:t>
+            </w:r>
+          </w:p>
+        </w:tc>
+        <w:tc>
+          <w:tcPr>
+            <w:tcW w:type="dxa" w:w="1300"/>
+          </w:tcPr>
+          <w:p>
+            <w:pPr>
+              <w:bidi w:val="0"/>
+              <w:jc w:val="both"/>
+              <w:ind w:left="0" w:right="0" w:firstLine="0" w:hanging="0"/>
+            </w:pPr>
+            <w:r/>
+            <w:r>
+              <w:rPr>
+                <w:rFonts w:ascii="Times New Roman" w:hAnsi="Times New Roman" w:cs="Times New Roman" w:eastAsia="Times New Roman"/>
+                <w:b w:val="0"/>
+                <w:i w:val="0"/>
+                <w:sz w:val="16"/>
+                <w:szCs w:val="16"/>
+                <w:lang w:val="en-US" w:bidi="en-US"/>
+              </w:rPr>
+              <w:t>Adequate</w:t>
+            </w:r>
+          </w:p>
+        </w:tc>
+        <w:tc>
+          <w:tcPr>
+            <w:tcW w:type="dxa" w:w="1100"/>
+          </w:tcPr>
+          <w:p>
+            <w:pPr>
+              <w:bidi w:val="0"/>
+              <w:jc w:val="both"/>
+              <w:ind w:left="0" w:right="0" w:firstLine="0" w:hanging="0"/>
+            </w:pPr>
+            <w:r/>
+            <w:r>
+              <w:rPr>
+                <w:rFonts w:ascii="Times New Roman" w:hAnsi="Times New Roman" w:cs="Times New Roman" w:eastAsia="Times New Roman"/>
+                <w:b w:val="0"/>
+                <w:i w:val="0"/>
+                <w:sz w:val="16"/>
+                <w:szCs w:val="16"/>
+                <w:lang w:val="en-US" w:bidi="en-US"/>
+              </w:rPr>
+              <w:t>No</w:t>
+            </w:r>
+          </w:p>
+        </w:tc>
+        <w:tc>
+          <w:tcPr>
+            <w:tcW w:type="dxa" w:w="1200"/>
+          </w:tcPr>
+          <w:p>
+            <w:pPr>
+              <w:bidi w:val="0"/>
+              <w:jc w:val="both"/>
+              <w:ind w:left="0" w:right="0" w:firstLine="0" w:hanging="0"/>
+            </w:pPr>
+            <w:r/>
+            <w:r>
+              <w:rPr>
+                <w:rFonts w:ascii="Times New Roman" w:hAnsi="Times New Roman" w:cs="Times New Roman" w:eastAsia="Times New Roman"/>
+                <w:b w:val="0"/>
+                <w:i w:val="0"/>
+                <w:sz w:val="16"/>
+                <w:szCs w:val="16"/>
+                <w:lang w:val="en-US" w:bidi="en-US"/>
+              </w:rPr>
+              <w:t>Open</w:t>
+            </w:r>
+          </w:p>
+        </w:tc>
+      </w:tr>
+      <w:tr>
+        <w:tc>
+          <w:tcPr>
+            <w:tcW w:type="dxa" w:w="1000"/>
+          </w:tcPr>
+          <w:p>
+            <w:pPr>
+              <w:bidi w:val="0"/>
+              <w:jc w:val="both"/>
+              <w:ind w:left="0" w:right="0" w:firstLine="0" w:hanging="0"/>
+            </w:pPr>
+            <w:r/>
+            <w:r>
+              <w:rPr>
+                <w:rFonts w:ascii="Times New Roman" w:hAnsi="Times New Roman" w:cs="Times New Roman" w:eastAsia="Times New Roman"/>
+                <w:b w:val="0"/>
+                <w:i w:val="0"/>
+                <w:sz w:val="16"/>
+                <w:szCs w:val="16"/>
+                <w:lang w:val="en-US" w:bidi="en-US"/>
+              </w:rPr>
+              <w:t>High</w:t>
+            </w:r>
+          </w:p>
+        </w:tc>
+        <w:tc>
+          <w:tcPr>
+            <w:tcW w:type="dxa" w:w="1300"/>
+          </w:tcPr>
+          <w:p>
+            <w:pPr>
+              <w:bidi w:val="0"/>
+              <w:jc w:val="both"/>
+              <w:ind w:left="0" w:right="0" w:firstLine="0" w:hanging="0"/>
+            </w:pPr>
+            <w:r/>
+            <w:r>
+              <w:rPr>
+                <w:rFonts w:ascii="Times New Roman" w:hAnsi="Times New Roman" w:cs="Times New Roman" w:eastAsia="Times New Roman"/>
+                <w:b w:val="0"/>
+                <w:i w:val="0"/>
+                <w:sz w:val="16"/>
+                <w:szCs w:val="16"/>
+                <w:lang w:val="en-US" w:bidi="en-US"/>
+              </w:rPr>
+              <w:t>Adequate</w:t>
+            </w:r>
+          </w:p>
+        </w:tc>
+        <w:tc>
+          <w:tcPr>
+            <w:tcW w:type="dxa" w:w="1100"/>
+          </w:tcPr>
+          <w:p>
+            <w:pPr>
+              <w:bidi w:val="0"/>
+              <w:jc w:val="both"/>
+              <w:ind w:left="0" w:right="0" w:firstLine="0" w:hanging="0"/>
+            </w:pPr>
+            <w:r/>
+            <w:r>
+              <w:rPr>
+                <w:rFonts w:ascii="Times New Roman" w:hAnsi="Times New Roman" w:cs="Times New Roman" w:eastAsia="Times New Roman"/>
+                <w:b w:val="0"/>
+                <w:i w:val="0"/>
+                <w:sz w:val="16"/>
+                <w:szCs w:val="16"/>
+                <w:lang w:val="en-US" w:bidi="en-US"/>
+              </w:rPr>
+              <w:t>Yes</w:t>
+            </w:r>
+          </w:p>
+        </w:tc>
+        <w:tc>
+          <w:tcPr>
+            <w:tcW w:type="dxa" w:w="1200"/>
+          </w:tcPr>
+          <w:p>
+            <w:pPr>
+              <w:bidi w:val="0"/>
+              <w:jc w:val="both"/>
+              <w:ind w:left="0" w:right="0" w:firstLine="0" w:hanging="0"/>
+            </w:pPr>
+            <w:r/>
+            <w:r>
+              <w:rPr>
+                <w:rFonts w:ascii="Times New Roman" w:hAnsi="Times New Roman" w:cs="Times New Roman" w:eastAsia="Times New Roman"/>
+                <w:b w:val="0"/>
+                <w:i w:val="0"/>
+                <w:sz w:val="16"/>
+                <w:szCs w:val="16"/>
+                <w:lang w:val="en-US" w:bidi="en-US"/>
+              </w:rPr>
+              <w:t>Closes with treatment</w:t>
+            </w:r>
+          </w:p>
+        </w:tc>
+      </w:tr>
+      <w:tr>
+        <w:tc>
+          <w:tcPr>
+            <w:tcW w:type="dxa" w:w="1000"/>
+          </w:tcPr>
+          <w:p>
+            <w:pPr>
+              <w:bidi w:val="0"/>
+              <w:jc w:val="both"/>
+              <w:ind w:left="0" w:right="0" w:firstLine="0" w:hanging="0"/>
+            </w:pPr>
+            <w:r/>
+            <w:r>
+              <w:rPr>
+                <w:rFonts w:ascii="Times New Roman" w:hAnsi="Times New Roman" w:cs="Times New Roman" w:eastAsia="Times New Roman"/>
+                <w:b w:val="0"/>
+                <w:i w:val="0"/>
+                <w:sz w:val="16"/>
+                <w:szCs w:val="16"/>
+                <w:lang w:val="en-US" w:bidi="en-US"/>
+              </w:rPr>
+              <w:t>Medium</w:t>
+            </w:r>
+          </w:p>
+        </w:tc>
+        <w:tc>
+          <w:tcPr>
+            <w:tcW w:type="dxa" w:w="1300"/>
+          </w:tcPr>
+          <w:p>
+            <w:pPr>
+              <w:bidi w:val="0"/>
+              <w:jc w:val="both"/>
+              <w:ind w:left="0" w:right="0" w:firstLine="0" w:hanging="0"/>
+            </w:pPr>
+            <w:r/>
+            <w:r>
+              <w:rPr>
+                <w:rFonts w:ascii="Times New Roman" w:hAnsi="Times New Roman" w:cs="Times New Roman" w:eastAsia="Times New Roman"/>
+                <w:b w:val="0"/>
+                <w:i w:val="0"/>
+                <w:sz w:val="16"/>
+                <w:szCs w:val="16"/>
+                <w:lang w:val="en-US" w:bidi="en-US"/>
+              </w:rPr>
+              <w:t>None</w:t>
+            </w:r>
+          </w:p>
+        </w:tc>
+        <w:tc>
+          <w:tcPr>
+            <w:tcW w:type="dxa" w:w="1100"/>
+          </w:tcPr>
+          <w:p>
+            <w:pPr>
+              <w:bidi w:val="0"/>
+              <w:jc w:val="both"/>
+              <w:ind w:left="0" w:right="0" w:firstLine="0" w:hanging="0"/>
+            </w:pPr>
+            <w:r/>
+            <w:r>
+              <w:rPr>
+                <w:rFonts w:ascii="Times New Roman" w:hAnsi="Times New Roman" w:cs="Times New Roman" w:eastAsia="Times New Roman"/>
+                <w:b w:val="0"/>
+                <w:i w:val="0"/>
+                <w:sz w:val="16"/>
+                <w:szCs w:val="16"/>
+                <w:lang w:val="en-US" w:bidi="en-US"/>
+              </w:rPr>
+              <w:t>Either</w:t>
+            </w:r>
+          </w:p>
+        </w:tc>
+        <w:tc>
+          <w:tcPr>
+            <w:tcW w:type="dxa" w:w="1200"/>
+          </w:tcPr>
+          <w:p>
+            <w:pPr>
+              <w:bidi w:val="0"/>
+              <w:jc w:val="both"/>
+              <w:ind w:left="0" w:right="0" w:firstLine="0" w:hanging="0"/>
+            </w:pPr>
+            <w:r/>
+            <w:r>
+              <w:rPr>
+                <w:rFonts w:ascii="Times New Roman" w:hAnsi="Times New Roman" w:cs="Times New Roman" w:eastAsia="Times New Roman"/>
+                <w:b w:val="0"/>
+                <w:i w:val="0"/>
+                <w:sz w:val="16"/>
+                <w:szCs w:val="16"/>
+                <w:lang w:val="en-US" w:bidi="en-US"/>
+              </w:rPr>
+              <w:t>Open</w:t>
+            </w:r>
+          </w:p>
+        </w:tc>
+      </w:tr>
+      <w:tr>
+        <w:tc>
+          <w:tcPr>
+            <w:tcW w:type="dxa" w:w="1000"/>
+          </w:tcPr>
+          <w:p>
+            <w:pPr>
+              <w:bidi w:val="0"/>
+              <w:jc w:val="both"/>
+              <w:ind w:left="0" w:right="0" w:firstLine="0" w:hanging="0"/>
+            </w:pPr>
+            <w:r/>
+            <w:r>
+              <w:rPr>
+                <w:rFonts w:ascii="Times New Roman" w:hAnsi="Times New Roman" w:cs="Times New Roman" w:eastAsia="Times New Roman"/>
+                <w:b w:val="0"/>
+                <w:i w:val="0"/>
+                <w:sz w:val="16"/>
+                <w:szCs w:val="16"/>
+                <w:lang w:val="en-US" w:bidi="en-US"/>
+              </w:rPr>
+              <w:t>Medium</w:t>
+            </w:r>
+          </w:p>
+        </w:tc>
+        <w:tc>
+          <w:tcPr>
+            <w:tcW w:type="dxa" w:w="1300"/>
+          </w:tcPr>
+          <w:p>
+            <w:pPr>
+              <w:bidi w:val="0"/>
+              <w:jc w:val="both"/>
+              <w:ind w:left="0" w:right="0" w:firstLine="0" w:hanging="0"/>
+            </w:pPr>
+            <w:r/>
+            <w:r>
+              <w:rPr>
+                <w:rFonts w:ascii="Times New Roman" w:hAnsi="Times New Roman" w:cs="Times New Roman" w:eastAsia="Times New Roman"/>
+                <w:b w:val="0"/>
+                <w:i w:val="0"/>
+                <w:sz w:val="16"/>
+                <w:szCs w:val="16"/>
+                <w:lang w:val="en-US" w:bidi="en-US"/>
+              </w:rPr>
+              <w:t>Partial or adequate</w:t>
+            </w:r>
+          </w:p>
+        </w:tc>
+        <w:tc>
+          <w:tcPr>
+            <w:tcW w:type="dxa" w:w="1100"/>
+          </w:tcPr>
+          <w:p>
+            <w:pPr>
+              <w:bidi w:val="0"/>
+              <w:jc w:val="both"/>
+              <w:ind w:left="0" w:right="0" w:firstLine="0" w:hanging="0"/>
+            </w:pPr>
+            <w:r/>
+            <w:r>
+              <w:rPr>
+                <w:rFonts w:ascii="Times New Roman" w:hAnsi="Times New Roman" w:cs="Times New Roman" w:eastAsia="Times New Roman"/>
+                <w:b w:val="0"/>
+                <w:i w:val="0"/>
+                <w:sz w:val="16"/>
+                <w:szCs w:val="16"/>
+                <w:lang w:val="en-US" w:bidi="en-US"/>
+              </w:rPr>
+              <w:t>Either</w:t>
+            </w:r>
+          </w:p>
+        </w:tc>
+        <w:tc>
+          <w:tcPr>
+            <w:tcW w:type="dxa" w:w="1200"/>
+          </w:tcPr>
+          <w:p>
+            <w:pPr>
+              <w:bidi w:val="0"/>
+              <w:jc w:val="both"/>
+              <w:ind w:left="0" w:right="0" w:firstLine="0" w:hanging="0"/>
+            </w:pPr>
+            <w:r/>
+            <w:r>
+              <w:rPr>
+                <w:rFonts w:ascii="Times New Roman" w:hAnsi="Times New Roman" w:cs="Times New Roman" w:eastAsia="Times New Roman"/>
+                <w:b w:val="0"/>
+                <w:i w:val="0"/>
+                <w:sz w:val="16"/>
+                <w:szCs w:val="16"/>
+                <w:lang w:val="en-US" w:bidi="en-US"/>
+              </w:rPr>
+              <w:t>Screened</w:t>
+            </w:r>
+          </w:p>
+        </w:tc>
+      </w:tr>
+      <w:tr>
+        <w:tc>
+          <w:tcPr>
+            <w:tcW w:type="dxa" w:w="1000"/>
+          </w:tcPr>
+          <w:p>
+            <w:pPr>
+              <w:bidi w:val="0"/>
+              <w:jc w:val="both"/>
+              <w:ind w:left="0" w:right="0" w:firstLine="0" w:hanging="0"/>
+            </w:pPr>
+            <w:r/>
+            <w:r>
+              <w:rPr>
+                <w:rFonts w:ascii="Times New Roman" w:hAnsi="Times New Roman" w:cs="Times New Roman" w:eastAsia="Times New Roman"/>
+                <w:b w:val="0"/>
+                <w:i w:val="0"/>
+                <w:sz w:val="16"/>
+                <w:szCs w:val="16"/>
+                <w:lang w:val="en-US" w:bidi="en-US"/>
+              </w:rPr>
+              <w:t>Low</w:t>
+            </w:r>
+          </w:p>
+        </w:tc>
+        <w:tc>
+          <w:tcPr>
+            <w:tcW w:type="dxa" w:w="1300"/>
+          </w:tcPr>
+          <w:p>
+            <w:pPr>
+              <w:bidi w:val="0"/>
+              <w:jc w:val="both"/>
+              <w:ind w:left="0" w:right="0" w:firstLine="0" w:hanging="0"/>
+            </w:pPr>
+            <w:r/>
+            <w:r>
+              <w:rPr>
+                <w:rFonts w:ascii="Times New Roman" w:hAnsi="Times New Roman" w:cs="Times New Roman" w:eastAsia="Times New Roman"/>
+                <w:b w:val="0"/>
+                <w:i w:val="0"/>
+                <w:sz w:val="16"/>
+                <w:szCs w:val="16"/>
+                <w:lang w:val="en-US" w:bidi="en-US"/>
+              </w:rPr>
+              <w:t>Any</w:t>
+            </w:r>
+          </w:p>
+        </w:tc>
+        <w:tc>
+          <w:tcPr>
+            <w:tcW w:type="dxa" w:w="1100"/>
+          </w:tcPr>
+          <w:p>
+            <w:pPr>
+              <w:bidi w:val="0"/>
+              <w:jc w:val="both"/>
+              <w:ind w:left="0" w:right="0" w:firstLine="0" w:hanging="0"/>
+            </w:pPr>
+            <w:r/>
+            <w:r>
+              <w:rPr>
+                <w:rFonts w:ascii="Times New Roman" w:hAnsi="Times New Roman" w:cs="Times New Roman" w:eastAsia="Times New Roman"/>
+                <w:b w:val="0"/>
+                <w:i w:val="0"/>
+                <w:sz w:val="16"/>
+                <w:szCs w:val="16"/>
+                <w:lang w:val="en-US" w:bidi="en-US"/>
+              </w:rPr>
+              <w:t>Either</w:t>
+            </w:r>
+          </w:p>
+        </w:tc>
+        <w:tc>
+          <w:tcPr>
+            <w:tcW w:type="dxa" w:w="1200"/>
+          </w:tcPr>
+          <w:p>
+            <w:pPr>
+              <w:bidi w:val="0"/>
+              <w:jc w:val="both"/>
+              <w:ind w:left="0" w:right="0" w:firstLine="0" w:hanging="0"/>
+            </w:pPr>
+            <w:r/>
+            <w:r>
+              <w:rPr>
+                <w:rFonts w:ascii="Times New Roman" w:hAnsi="Times New Roman" w:cs="Times New Roman" w:eastAsia="Times New Roman"/>
+                <w:b w:val="0"/>
+                <w:i w:val="0"/>
+                <w:sz w:val="16"/>
+                <w:szCs w:val="16"/>
+                <w:lang w:val="en-US" w:bidi="en-US"/>
+              </w:rPr>
+              <w:t>Screened</w:t>
+            </w:r>
+          </w:p>
+        </w:tc>
+      </w:tr>
+    </w:tbl>
+    <w:p>
+      <w:pPr>
+        <w:pStyle w:val="Heading1"/>
+        <w:bidi w:val="0"/>
+        <w:jc w:val="left"/>
+      </w:pPr>
+      <w:r>
+        <w:rPr>
+          <w:rFonts w:ascii="Times New Roman" w:hAnsi="Times New Roman" w:cs="Times New Roman" w:eastAsia="Times New Roman"/>
+          <w:b/>
+          <w:i w:val="0"/>
+          <w:sz w:val="24"/>
+          <w:szCs w:val="24"/>
+          <w:lang w:val="en-US" w:bidi="en-US"/>
+        </w:rPr>
         <w:t>Two controls</w:t>
       </w:r>
     </w:p>
@@ -677,7 +1458,7 @@
           <w:szCs w:val="20"/>
           <w:lang w:val="en-US" w:bidi="en-US"/>
         </w:rPr>
-        <w:t>The negative control is a declared score table for a device model. The question was whether a size choice would be licensed. There is no ISO 14879-1 test and no implant. Model influence is 2 and decision consequence is 3. Treatment scores are 0.12, 0.11, and 0.13. Control scores are 0.20, 0.19, and 0.21. The declared labels are software in a medical device, class B of IEC 62304 [8], category II of the International Medical Device Regulators Forum (IMDRF) [9], and evidence categories 1, 3, and 8 of the 2023 guidance, with the model declared as physics-based. Replay is not verified, and the artifact manifest is among the conditions for leaving grade 0, so the grade is 0. ASME VVUQ 40.1-2026 is a worked tibial-tray example, not a pass bit, and that example is not run here [10]. Table 2 records the distance between the two controls.</w:t>
+        <w:t>The negative control is a declared score table for a device model. The question was whether a size choice would be licensed. There is no ISO 14879-1 test and no implant. Model influence is 2 and decision consequence is 3. Treatment scores are 0.12, 0.11, and 0.13. Control scores are 0.20, 0.19, and 0.21. The declared labels are software in a medical device, class B of IEC 62304 [9], category II of IMDRF [10], and evidence categories 1, 3, and 8 of the 2023 guidance, with the model declared as physics-based. Replay is not verified, and the artifact manifest is among the conditions for leaving grade 0, so the grade is 0. ASME VVUQ 40.1-2026 is a worked tibial-tray example, not a pass bit, and that example is not run here [8]. Table 3 records the distance between the two controls.</w:t>
       </w:r>
     </w:p>
     <w:p>
@@ -696,7 +1477,7 @@
           <w:szCs w:val="16"/>
           <w:lang w:val="en-US" w:bidi="en-US"/>
         </w:rPr>
-        <w:t>Table 2. Positive and negative controls</w:t>
+        <w:t>Table 3. Positive and negative controls</w:t>
       </w:r>
     </w:p>
     <w:tbl>
@@ -1102,7 +1883,7 @@
           <w:szCs w:val="16"/>
           <w:lang w:val="en-US" w:bidi="en-US"/>
         </w:rPr>
-        <w:t>Table 3. Phenomenon closure on the HE01 study</w:t>
+        <w:t>Table 4. Phenomenon closure on the HE01 study</w:t>
       </w:r>
     </w:p>
     <w:tbl>
@@ -1529,7 +2310,7 @@
           <w:szCs w:val="20"/>
           <w:lang w:val="en-US" w:bidi="en-US"/>
         </w:rPr>
-        <w:t>Risk on this port is the maximum of declared influence and declared consequence. The question is the one ASME V&amp;V 40 asks, whether the evidence is commensurate with model risk [2]. The numbers are this implementation, not an FDA table. Risk 1 asks for grade 2, risk 2 for grade 3, and risk 3 for grade 4. From risk 2 upward, an open high-importance phenomenon also blocks the bar. The bar does not call the auditor and does not change the grade. The device table is risk 3 at grade 0, so the bar is not met. HE01 with only the executed source-bias phenomenon meets risk 3 and stays at grade 4. The same campaign, with contact stress added and no arm for it, is still grade 4, and the bar is not met. Declaring the risk neither closes the open phenomenon nor lowers the grade. The committed result has fingerprint prefix b053e7f1. Table 4 is that comparison.</w:t>
+        <w:t>Risk on this port is the maximum of declared influence and declared consequence. The question is the one ASME V&amp;V 40 asks, whether the evidence is commensurate with model risk [2]. The numbers are this implementation, not an FDA table. Risk 1 asks for grade 2, risk 2 for grade 3, and risk 3 for grade 4. From risk 2 upward, an open high-importance phenomenon also blocks the bar. The bar does not call the auditor and does not change the grade. The device table is risk 3 at grade 0, so the bar is not met. HE01 with only the executed source-bias phenomenon meets risk 3 and stays at grade 4. The same campaign, with contact stress added and no arm for it, is still grade 4, and the bar is not met. Declaring the risk neither closes the open phenomenon nor lowers the grade. The committed result has fingerprint prefix b053e7f1. Table 5 is that comparison.</w:t>
       </w:r>
     </w:p>
     <w:p>
@@ -1548,7 +2329,7 @@
           <w:szCs w:val="16"/>
           <w:lang w:val="en-US" w:bidi="en-US"/>
         </w:rPr>
-        <w:t>Table 4. Declared risk against the audit grade</w:t>
+        <w:t>Table 5. Declared risk against the audit grade</w:t>
       </w:r>
     </w:p>
     <w:tbl>
@@ -1999,7 +2780,7 @@
           <w:szCs w:val="20"/>
           <w:lang w:val="en-US" w:bidi="en-US"/>
         </w:rPr>
-        <w:t>The intact reference is grade 4. Six bundles were built by removing one condition, and all six stayed below 4. Identical arms, a zero-width interval, and an unpaired comparison stay at grade 1. Missing replay, and an empty limitation, stay at grade 2. Three seeds stay at grade 3. The six bundles are not an independent random sample, so no binomial interval and no false-accept rate are reported. The count is not a percentage of papers. Table 5 lists the grades. A separate row changes the label of a sensitivity arm and still receives grade 4, because a confirmatory negative-control arm is still in the bundle. The row is a probe, not an escape trial. The deletion file prefix is 3c8a8a1f.</w:t>
+        <w:t>The intact reference is grade 4. Six bundles were built by removing one condition, and all six stayed below 4. Identical arms, a zero-width interval, and an unpaired comparison stay at grade 1. Missing replay, and an empty limitation, stay at grade 2. Three seeds stay at grade 3. The six bundles are not an independent random sample, so no binomial interval and no false-accept rate are reported. The count is not a percentage of papers. Table 6 lists the grades. A separate row changes the label of a sensitivity arm and still receives grade 4, because a confirmatory negative-control arm is still in the bundle. The row is a probe, not an escape trial. The deletion file prefix is 3c8a8a1f.</w:t>
       </w:r>
     </w:p>
     <w:p>
@@ -2018,7 +2799,7 @@
           <w:szCs w:val="16"/>
           <w:lang w:val="en-US" w:bidi="en-US"/>
         </w:rPr>
-        <w:t>Table 5. One condition removed from a grade-4 reference</w:t>
+        <w:t>Table 6. One condition removed from a grade-4 reference</w:t>
       </w:r>
     </w:p>
     <w:tbl>
@@ -2408,6 +3189,499 @@
           <w:szCs w:val="24"/>
           <w:lang w:val="en-US" w:bidi="en-US"/>
         </w:rPr>
+        <w:t>Arms in the positive control</w:t>
+      </w:r>
+    </w:p>
+    <w:p>
+      <w:pPr>
+        <w:bidi w:val="0"/>
+        <w:jc w:val="both"/>
+      </w:pPr>
+      <w:r>
+        <w:rPr>
+          <w:rFonts w:ascii="Times New Roman" w:hAnsi="Times New Roman" w:cs="Times New Roman" w:eastAsia="Times New Roman"/>
+          <w:b w:val="0"/>
+          <w:i w:val="0"/>
+          <w:sz w:val="20"/>
+          <w:szCs w:val="20"/>
+          <w:lang w:val="en-US" w:bidi="en-US"/>
+        </w:rPr>
+        <w:t>The arm role is read from the campaign, and the results file is not rewritten. Treatment is only the arm with source bias on. Closure asks for that role. A dose arm, a negative control, and a channel that is off do not close a phenomenon, even when they sit in the same grade-4 file. Table 7 lists the roles.</w:t>
+      </w:r>
+    </w:p>
+    <w:p>
+      <w:pPr>
+        <w:pStyle w:val="Caption"/>
+        <w:keepNext/>
+        <w:bidi w:val="0"/>
+        <w:jc w:val="center"/>
+      </w:pPr>
+      <w:r>
+        <w:rPr>
+          <w:rFonts w:ascii="Times New Roman" w:hAnsi="Times New Roman" w:cs="Times New Roman" w:eastAsia="Times New Roman"/>
+          <w:b/>
+          <w:i w:val="0"/>
+          <w:sz w:val="16"/>
+          <w:szCs w:val="16"/>
+          <w:lang w:val="en-US" w:bidi="en-US"/>
+        </w:rPr>
+        <w:t>Table 7. Arm role in the positive control</w:t>
+      </w:r>
+    </w:p>
+    <w:tbl>
+      <w:tblPr>
+        <w:tblW w:type="auto" w:w="0"/>
+        <w:jc w:val="center"/>
+        <w:tblLayout w:type="fixed"/>
+        <w:tblLook w:firstColumn="1" w:firstRow="1" w:lastColumn="0" w:lastRow="0" w:noHBand="0" w:noVBand="1" w:val="04A0"/>
+        <w:tblBorders>
+          <w:top w:val="single" w:sz="4" w:space="0" w:color="000000"/>
+          <w:left w:val="single" w:sz="4" w:space="0" w:color="000000"/>
+          <w:bottom w:val="single" w:sz="4" w:space="0" w:color="000000"/>
+          <w:right w:val="single" w:sz="4" w:space="0" w:color="000000"/>
+          <w:insideH w:val="single" w:sz="4" w:space="0" w:color="000000"/>
+          <w:insideV w:val="single" w:sz="4" w:space="0" w:color="000000"/>
+        </w:tblBorders>
+        <w:tblW w:w="4600" w:type="dxa"/>
+        <w:tblLayout w:type="fixed"/>
+      </w:tblPr>
+      <w:tblGrid>
+        <w:gridCol w:w="2300"/>
+        <w:gridCol w:w="2300"/>
+      </w:tblGrid>
+      <w:tr>
+        <w:tc>
+          <w:tcPr>
+            <w:tcW w:type="dxa" w:w="2300"/>
+          </w:tcPr>
+          <w:p>
+            <w:pPr>
+              <w:bidi w:val="0"/>
+              <w:jc w:val="center"/>
+              <w:ind w:left="0" w:right="0" w:firstLine="0" w:hanging="0"/>
+            </w:pPr>
+            <w:r/>
+            <w:r>
+              <w:rPr>
+                <w:rFonts w:ascii="Times New Roman" w:hAnsi="Times New Roman" w:cs="Times New Roman" w:eastAsia="Times New Roman"/>
+                <w:b/>
+                <w:i w:val="0"/>
+                <w:sz w:val="16"/>
+                <w:szCs w:val="16"/>
+                <w:lang w:val="en-US" w:bidi="en-US"/>
+              </w:rPr>
+              <w:t>Arm</w:t>
+            </w:r>
+          </w:p>
+        </w:tc>
+        <w:tc>
+          <w:tcPr>
+            <w:tcW w:type="dxa" w:w="2300"/>
+          </w:tcPr>
+          <w:p>
+            <w:pPr>
+              <w:bidi w:val="0"/>
+              <w:jc w:val="center"/>
+              <w:ind w:left="0" w:right="0" w:firstLine="0" w:hanging="0"/>
+            </w:pPr>
+            <w:r/>
+            <w:r>
+              <w:rPr>
+                <w:rFonts w:ascii="Times New Roman" w:hAnsi="Times New Roman" w:cs="Times New Roman" w:eastAsia="Times New Roman"/>
+                <w:b/>
+                <w:i w:val="0"/>
+                <w:sz w:val="16"/>
+                <w:szCs w:val="16"/>
+                <w:lang w:val="en-US" w:bidi="en-US"/>
+              </w:rPr>
+              <w:t>Role</w:t>
+            </w:r>
+          </w:p>
+        </w:tc>
+      </w:tr>
+      <w:tr>
+        <w:tc>
+          <w:tcPr>
+            <w:tcW w:type="dxa" w:w="2300"/>
+          </w:tcPr>
+          <w:p>
+            <w:pPr>
+              <w:bidi w:val="0"/>
+              <w:jc w:val="both"/>
+              <w:ind w:left="0" w:right="0" w:firstLine="0" w:hanging="0"/>
+            </w:pPr>
+            <w:r/>
+            <w:r>
+              <w:rPr>
+                <w:rFonts w:ascii="Times New Roman" w:hAnsi="Times New Roman" w:cs="Times New Roman" w:eastAsia="Times New Roman"/>
+                <w:b w:val="0"/>
+                <w:i w:val="0"/>
+                <w:sz w:val="16"/>
+                <w:szCs w:val="16"/>
+                <w:lang w:val="en-US" w:bidi="en-US"/>
+              </w:rPr>
+              <w:t>Source bias on</w:t>
+            </w:r>
+          </w:p>
+        </w:tc>
+        <w:tc>
+          <w:tcPr>
+            <w:tcW w:type="dxa" w:w="2300"/>
+          </w:tcPr>
+          <w:p>
+            <w:pPr>
+              <w:bidi w:val="0"/>
+              <w:jc w:val="both"/>
+              <w:ind w:left="0" w:right="0" w:firstLine="0" w:hanging="0"/>
+            </w:pPr>
+            <w:r/>
+            <w:r>
+              <w:rPr>
+                <w:rFonts w:ascii="Times New Roman" w:hAnsi="Times New Roman" w:cs="Times New Roman" w:eastAsia="Times New Roman"/>
+                <w:b w:val="0"/>
+                <w:i w:val="0"/>
+                <w:sz w:val="16"/>
+                <w:szCs w:val="16"/>
+                <w:lang w:val="en-US" w:bidi="en-US"/>
+              </w:rPr>
+              <w:t>Treatment</w:t>
+            </w:r>
+          </w:p>
+        </w:tc>
+      </w:tr>
+      <w:tr>
+        <w:tc>
+          <w:tcPr>
+            <w:tcW w:type="dxa" w:w="2300"/>
+          </w:tcPr>
+          <w:p>
+            <w:pPr>
+              <w:bidi w:val="0"/>
+              <w:jc w:val="both"/>
+              <w:ind w:left="0" w:right="0" w:firstLine="0" w:hanging="0"/>
+            </w:pPr>
+            <w:r/>
+            <w:r>
+              <w:rPr>
+                <w:rFonts w:ascii="Times New Roman" w:hAnsi="Times New Roman" w:cs="Times New Roman" w:eastAsia="Times New Roman"/>
+                <w:b w:val="0"/>
+                <w:i w:val="0"/>
+                <w:sz w:val="16"/>
+                <w:szCs w:val="16"/>
+                <w:lang w:val="en-US" w:bidi="en-US"/>
+              </w:rPr>
+              <w:t>Source bias off</w:t>
+            </w:r>
+          </w:p>
+        </w:tc>
+        <w:tc>
+          <w:tcPr>
+            <w:tcW w:type="dxa" w:w="2300"/>
+          </w:tcPr>
+          <w:p>
+            <w:pPr>
+              <w:bidi w:val="0"/>
+              <w:jc w:val="both"/>
+              <w:ind w:left="0" w:right="0" w:firstLine="0" w:hanging="0"/>
+            </w:pPr>
+            <w:r/>
+            <w:r>
+              <w:rPr>
+                <w:rFonts w:ascii="Times New Roman" w:hAnsi="Times New Roman" w:cs="Times New Roman" w:eastAsia="Times New Roman"/>
+                <w:b w:val="0"/>
+                <w:i w:val="0"/>
+                <w:sz w:val="16"/>
+                <w:szCs w:val="16"/>
+                <w:lang w:val="en-US" w:bidi="en-US"/>
+              </w:rPr>
+              <w:t>Mechanism removed</w:t>
+            </w:r>
+          </w:p>
+        </w:tc>
+      </w:tr>
+      <w:tr>
+        <w:tc>
+          <w:tcPr>
+            <w:tcW w:type="dxa" w:w="2300"/>
+          </w:tcPr>
+          <w:p>
+            <w:pPr>
+              <w:bidi w:val="0"/>
+              <w:jc w:val="both"/>
+              <w:ind w:left="0" w:right="0" w:firstLine="0" w:hanging="0"/>
+            </w:pPr>
+            <w:r/>
+            <w:r>
+              <w:rPr>
+                <w:rFonts w:ascii="Times New Roman" w:hAnsi="Times New Roman" w:cs="Times New Roman" w:eastAsia="Times New Roman"/>
+                <w:b w:val="0"/>
+                <w:i w:val="0"/>
+                <w:sz w:val="16"/>
+                <w:szCs w:val="16"/>
+                <w:lang w:val="en-US" w:bidi="en-US"/>
+              </w:rPr>
+              <w:t>Closed channel</w:t>
+            </w:r>
+          </w:p>
+        </w:tc>
+        <w:tc>
+          <w:tcPr>
+            <w:tcW w:type="dxa" w:w="2300"/>
+          </w:tcPr>
+          <w:p>
+            <w:pPr>
+              <w:bidi w:val="0"/>
+              <w:jc w:val="both"/>
+              <w:ind w:left="0" w:right="0" w:firstLine="0" w:hanging="0"/>
+            </w:pPr>
+            <w:r/>
+            <w:r>
+              <w:rPr>
+                <w:rFonts w:ascii="Times New Roman" w:hAnsi="Times New Roman" w:cs="Times New Roman" w:eastAsia="Times New Roman"/>
+                <w:b w:val="0"/>
+                <w:i w:val="0"/>
+                <w:sz w:val="16"/>
+                <w:szCs w:val="16"/>
+                <w:lang w:val="en-US" w:bidi="en-US"/>
+              </w:rPr>
+              <w:t>Channel off</w:t>
+            </w:r>
+          </w:p>
+        </w:tc>
+      </w:tr>
+      <w:tr>
+        <w:tc>
+          <w:tcPr>
+            <w:tcW w:type="dxa" w:w="2300"/>
+          </w:tcPr>
+          <w:p>
+            <w:pPr>
+              <w:bidi w:val="0"/>
+              <w:jc w:val="both"/>
+              <w:ind w:left="0" w:right="0" w:firstLine="0" w:hanging="0"/>
+            </w:pPr>
+            <w:r/>
+            <w:r>
+              <w:rPr>
+                <w:rFonts w:ascii="Times New Roman" w:hAnsi="Times New Roman" w:cs="Times New Roman" w:eastAsia="Times New Roman"/>
+                <w:b w:val="0"/>
+                <w:i w:val="0"/>
+                <w:sz w:val="16"/>
+                <w:szCs w:val="16"/>
+                <w:lang w:val="en-US" w:bidi="en-US"/>
+              </w:rPr>
+              <w:t>Empty content</w:t>
+            </w:r>
+          </w:p>
+        </w:tc>
+        <w:tc>
+          <w:tcPr>
+            <w:tcW w:type="dxa" w:w="2300"/>
+          </w:tcPr>
+          <w:p>
+            <w:pPr>
+              <w:bidi w:val="0"/>
+              <w:jc w:val="both"/>
+              <w:ind w:left="0" w:right="0" w:firstLine="0" w:hanging="0"/>
+            </w:pPr>
+            <w:r/>
+            <w:r>
+              <w:rPr>
+                <w:rFonts w:ascii="Times New Roman" w:hAnsi="Times New Roman" w:cs="Times New Roman" w:eastAsia="Times New Roman"/>
+                <w:b w:val="0"/>
+                <w:i w:val="0"/>
+                <w:sz w:val="16"/>
+                <w:szCs w:val="16"/>
+                <w:lang w:val="en-US" w:bidi="en-US"/>
+              </w:rPr>
+              <w:t>Negative control</w:t>
+            </w:r>
+          </w:p>
+        </w:tc>
+      </w:tr>
+      <w:tr>
+        <w:tc>
+          <w:tcPr>
+            <w:tcW w:type="dxa" w:w="2300"/>
+          </w:tcPr>
+          <w:p>
+            <w:pPr>
+              <w:bidi w:val="0"/>
+              <w:jc w:val="both"/>
+              <w:ind w:left="0" w:right="0" w:firstLine="0" w:hanging="0"/>
+            </w:pPr>
+            <w:r/>
+            <w:r>
+              <w:rPr>
+                <w:rFonts w:ascii="Times New Roman" w:hAnsi="Times New Roman" w:cs="Times New Roman" w:eastAsia="Times New Roman"/>
+                <w:b w:val="0"/>
+                <w:i w:val="0"/>
+                <w:sz w:val="16"/>
+                <w:szCs w:val="16"/>
+                <w:lang w:val="en-US" w:bidi="en-US"/>
+              </w:rPr>
+              <w:t>Matched content</w:t>
+            </w:r>
+          </w:p>
+        </w:tc>
+        <w:tc>
+          <w:tcPr>
+            <w:tcW w:type="dxa" w:w="2300"/>
+          </w:tcPr>
+          <w:p>
+            <w:pPr>
+              <w:bidi w:val="0"/>
+              <w:jc w:val="both"/>
+              <w:ind w:left="0" w:right="0" w:firstLine="0" w:hanging="0"/>
+            </w:pPr>
+            <w:r/>
+            <w:r>
+              <w:rPr>
+                <w:rFonts w:ascii="Times New Roman" w:hAnsi="Times New Roman" w:cs="Times New Roman" w:eastAsia="Times New Roman"/>
+                <w:b w:val="0"/>
+                <w:i w:val="0"/>
+                <w:sz w:val="16"/>
+                <w:szCs w:val="16"/>
+                <w:lang w:val="en-US" w:bidi="en-US"/>
+              </w:rPr>
+              <w:t>Negative control</w:t>
+            </w:r>
+          </w:p>
+        </w:tc>
+      </w:tr>
+      <w:tr>
+        <w:tc>
+          <w:tcPr>
+            <w:tcW w:type="dxa" w:w="2300"/>
+          </w:tcPr>
+          <w:p>
+            <w:pPr>
+              <w:bidi w:val="0"/>
+              <w:jc w:val="both"/>
+              <w:ind w:left="0" w:right="0" w:firstLine="0" w:hanging="0"/>
+            </w:pPr>
+            <w:r/>
+            <w:r>
+              <w:rPr>
+                <w:rFonts w:ascii="Times New Roman" w:hAnsi="Times New Roman" w:cs="Times New Roman" w:eastAsia="Times New Roman"/>
+                <w:b w:val="0"/>
+                <w:i w:val="0"/>
+                <w:sz w:val="16"/>
+                <w:szCs w:val="16"/>
+                <w:lang w:val="en-US" w:bidi="en-US"/>
+              </w:rPr>
+              <w:t>Matched activity</w:t>
+            </w:r>
+          </w:p>
+        </w:tc>
+        <w:tc>
+          <w:tcPr>
+            <w:tcW w:type="dxa" w:w="2300"/>
+          </w:tcPr>
+          <w:p>
+            <w:pPr>
+              <w:bidi w:val="0"/>
+              <w:jc w:val="both"/>
+              <w:ind w:left="0" w:right="0" w:firstLine="0" w:hanging="0"/>
+            </w:pPr>
+            <w:r/>
+            <w:r>
+              <w:rPr>
+                <w:rFonts w:ascii="Times New Roman" w:hAnsi="Times New Roman" w:cs="Times New Roman" w:eastAsia="Times New Roman"/>
+                <w:b w:val="0"/>
+                <w:i w:val="0"/>
+                <w:sz w:val="16"/>
+                <w:szCs w:val="16"/>
+                <w:lang w:val="en-US" w:bidi="en-US"/>
+              </w:rPr>
+              <w:t>Negative control</w:t>
+            </w:r>
+          </w:p>
+        </w:tc>
+      </w:tr>
+      <w:tr>
+        <w:tc>
+          <w:tcPr>
+            <w:tcW w:type="dxa" w:w="2300"/>
+          </w:tcPr>
+          <w:p>
+            <w:pPr>
+              <w:bidi w:val="0"/>
+              <w:jc w:val="both"/>
+              <w:ind w:left="0" w:right="0" w:firstLine="0" w:hanging="0"/>
+            </w:pPr>
+            <w:r/>
+            <w:r>
+              <w:rPr>
+                <w:rFonts w:ascii="Times New Roman" w:hAnsi="Times New Roman" w:cs="Times New Roman" w:eastAsia="Times New Roman"/>
+                <w:b w:val="0"/>
+                <w:i w:val="0"/>
+                <w:sz w:val="16"/>
+                <w:szCs w:val="16"/>
+                <w:lang w:val="en-US" w:bidi="en-US"/>
+              </w:rPr>
+              <w:t>Predictive capsule</w:t>
+            </w:r>
+          </w:p>
+        </w:tc>
+        <w:tc>
+          <w:tcPr>
+            <w:tcW w:type="dxa" w:w="2300"/>
+          </w:tcPr>
+          <w:p>
+            <w:pPr>
+              <w:bidi w:val="0"/>
+              <w:jc w:val="both"/>
+              <w:ind w:left="0" w:right="0" w:firstLine="0" w:hanging="0"/>
+            </w:pPr>
+            <w:r/>
+            <w:r>
+              <w:rPr>
+                <w:rFonts w:ascii="Times New Roman" w:hAnsi="Times New Roman" w:cs="Times New Roman" w:eastAsia="Times New Roman"/>
+                <w:b w:val="0"/>
+                <w:i w:val="0"/>
+                <w:sz w:val="16"/>
+                <w:szCs w:val="16"/>
+                <w:lang w:val="en-US" w:bidi="en-US"/>
+              </w:rPr>
+              <w:t>Dose</w:t>
+            </w:r>
+          </w:p>
+        </w:tc>
+      </w:tr>
+    </w:tbl>
+    <w:p>
+      <w:pPr>
+        <w:bidi w:val="0"/>
+        <w:jc w:val="both"/>
+      </w:pPr>
+      <w:r>
+        <w:rPr>
+          <w:rFonts w:ascii="Times New Roman" w:hAnsi="Times New Roman" w:cs="Times New Roman" w:eastAsia="Times New Roman"/>
+          <w:b w:val="0"/>
+          <w:i w:val="0"/>
+          <w:sz w:val="20"/>
+          <w:szCs w:val="20"/>
+          <w:lang w:val="en-US" w:bidi="en-US"/>
+        </w:rPr>
+        <w:t>The difference 16.49 sets treatment against removal of the mechanism, and both settings change together. The difference 30.67 is the same number for the closed channel and for empty content, and those two baselines share one value fingerprint. The width of the first interval is 19.135 minus 14.249, about 4.89. An optional studentized interval on the same 30 differences runs from about 14.05 to 19.30 and leaves the results file unchanged. Each deletion stops at the rung that owns the removed condition. Identical arms, a zero-width interval, and an unpaired comparison do not leave grade 1. Missing replay, and an empty limitation, stay at grade 2. Three seeds pass the interval and stay at grade 3, because 16 seeds are the condition for grade 4. The role-change probe was kept out of the six, and no rate was built from it. A hash of the word placeholder is a valid digest and is not rejected on its own. The study file prefix is d176f0ab and the deletion-file prefix is 3c8a8a1f. Both files were produced by running the auditor.</w:t>
+      </w:r>
+    </w:p>
+    <w:p>
+      <w:pPr>
+        <w:pStyle w:val="Heading1"/>
+        <w:bidi w:val="0"/>
+        <w:jc w:val="left"/>
+      </w:pPr>
+      <w:r>
+        <w:rPr>
+          <w:rFonts w:ascii="Times New Roman" w:hAnsi="Times New Roman" w:cs="Times New Roman" w:eastAsia="Times New Roman"/>
+          <w:b/>
+          <w:i w:val="0"/>
+          <w:sz w:val="24"/>
+          <w:szCs w:val="24"/>
+          <w:lang w:val="en-US" w:bidi="en-US"/>
+        </w:rPr>
         <w:t>Discussion</w:t>
       </w:r>
     </w:p>
@@ -2691,6 +3965,24 @@
           <w:szCs w:val="16"/>
           <w:lang w:val="en-US" w:bidi="en-US"/>
         </w:rPr>
+        <w:t>Tibial Tray Worst-Case Size Identification for Fatigue Testing, ASME VVUQ 40.1-2026. New York: ASME, 2026.</w:t>
+      </w:r>
+    </w:p>
+    <w:p>
+      <w:pPr>
+        <w:pStyle w:val="References"/>
+        <w:bidi w:val="0"/>
+        <w:jc w:val="both"/>
+      </w:pPr>
+      <w:r>
+        <w:rPr>
+          <w:rFonts w:ascii="Times New Roman" w:hAnsi="Times New Roman" w:cs="Times New Roman" w:eastAsia="Times New Roman"/>
+          <w:b w:val="0"/>
+          <w:i w:val="0"/>
+          <w:sz w:val="16"/>
+          <w:szCs w:val="16"/>
+          <w:lang w:val="en-US" w:bidi="en-US"/>
+        </w:rPr>
         <w:t>IEC 62304:2006+AMD1:2015, Medical device software, Software life cycle processes. Geneva: IEC.</w:t>
       </w:r>
     </w:p>
@@ -2710,24 +4002,6 @@
           <w:lang w:val="en-US" w:bidi="en-US"/>
         </w:rPr>
         <w:t>Software as a Medical Device: Possible Framework for Risk Categorization and Characterization Considerations, IMDRF/SaMD WG/N12 and N81.</w:t>
-      </w:r>
-    </w:p>
-    <w:p>
-      <w:pPr>
-        <w:pStyle w:val="References"/>
-        <w:bidi w:val="0"/>
-        <w:jc w:val="both"/>
-      </w:pPr>
-      <w:r>
-        <w:rPr>
-          <w:rFonts w:ascii="Times New Roman" w:hAnsi="Times New Roman" w:cs="Times New Roman" w:eastAsia="Times New Roman"/>
-          <w:b w:val="0"/>
-          <w:i w:val="0"/>
-          <w:sz w:val="16"/>
-          <w:szCs w:val="16"/>
-          <w:lang w:val="en-US" w:bidi="en-US"/>
-        </w:rPr>
-        <w:t>Tibial Tray Worst-Case Size Identification for Fatigue Testing, ASME VVUQ 40.1-2026. New York: ASME, 2026.</w:t>
       </w:r>
     </w:p>
     <w:p>

</xml_diff>

<commit_message>
docs(baic): correct the English citations and the grade-5 rule
IMDRF category II now cites N12 only. Journal, MIRROR, and NovaFabric
DOIs are in the reference list. Grade 5 states the three conditions that
leave grade 4, and the shuffled-capsule arm is named as recorded.
</commit_message>
<xml_diff>
--- a/paper/baic/BAIC2026_Jamei_en.docx
+++ b/paper/baic/BAIC2026_Jamei_en.docx
@@ -95,7 +95,7 @@
           <w:szCs w:val="18"/>
           <w:lang w:val="en-US" w:bidi="en-US"/>
         </w:rPr>
-        <w:t>Abstract- Credibility guides say what evidence a computational model should carry. They do not grade one file from its declared label. This paper grades the bundle. The label stored in the campaign file maps only to an internal grade of 3. Public grade 4 is recorded only when replay is verified and an interval is present on at least 16 seeds. Thirty paired seeds reach grade 4. The contrast of 16.49 comes from two settings changed together. A device score table that carries regulatory labels and no recorded run stays at grade 0. A declared model risk has a separate bar and does not move the grade. Six deletions of a ladder condition fall below grade 4. That count is not a rate over the published literature.</w:t>
+        <w:t>Abstract- Credibility guides say what evidence a computational model should carry. They do not grade one file from its declared label. This paper grades the bundle. The label intervention_supported maps only to an internal grade of 3. Public grade 4 is recorded only when replay is verified and an interval is present on at least 16 seeds. Thirty paired seeds reach grade 4. The contrast of 16.49 is receiver energy in the simulation, from two settings changed together, not a clinical result. A device score table that carries regulatory labels and no recorded run stays at grade 0. A declared model risk has a separate bar and does not move the grade. Six deletions of a ladder condition fall below grade 4. That count is not a rate over the published literature.</w:t>
       </w:r>
     </w:p>
     <w:p>
@@ -164,7 +164,7 @@
           <w:szCs w:val="20"/>
           <w:lang w:val="en-US" w:bidi="en-US"/>
         </w:rPr>
-        <w:t>The November 2023 guidance of the U.S. Food and Drug Administration ties the credibility of a physics-based simulation to the decision it informs, and it places a standalone machine-learning model outside that scope [1]. The American Society of Mechanical Engineers (ASME) V&amp;V 40 asks for the question of interest, the context of use, and the consequence of the decision [2]. NASA-STD-7009B separates the capability of a model from permission to transfer a result [3]. None of these documents returns a grade for one research file. Pathmanathan and colleagues carry the credibility chain down to the submodels of an in silico clinical trial [4]. This paper asks the same question of one auditor: with only the evidence inside the bundle, where does the claim stop.</w:t>
+        <w:t>The November 2023 guidance of the U.S. Food and Drug Administration ties the credibility of a physics-based simulation to the decision it informs, and it places a standalone machine-learning model outside that scope [1]. The American Society of Mechanical Engineers (ASME) V&amp;V 40 asks for the question of interest, the context of use, and the consequence of the decision [2]. NASA-STD-7009B separates the capability of a model from permission to transfer a result [3]. None of these documents returns a grade for one research file. Pathmanathan and colleagues carry the credibility chain down to the submodels of an in silico clinical trial [4]. This paper asks the same question of one auditor: with only the evidence inside the bundle, where does the claim stop?</w:t>
       </w:r>
     </w:p>
     <w:p>
@@ -198,7 +198,7 @@
           <w:szCs w:val="20"/>
           <w:lang w:val="en-US" w:bidi="en-US"/>
         </w:rPr>
-        <w:t>The engine does not know a domain, and it was not rewritten for medicine. A domain profile names the port: artificial life, biomedical, or hardware. Records from Avida, a table from MABE2, and an Overview, Design concepts, and Details description are read through that port and are not the product of this paper. An ESP32 port is implemented and is not one of the measurements below. A configuration string that would claim an ASME V&amp;V 40 pass is rejected. This tool does not issue an ASME, FDA, or IEC certificate. Viceconti and colleagues set an in silico trial on context, risk, and a verification chain [5]. Here that chain becomes a grade on one file, not a certificate for a product.</w:t>
+        <w:t>The auditor, ClaimGate, is part of CodonTrace Genesis. The engine does not know a domain, and it was not rewritten for medicine. A domain profile names the port: artificial life, biomedical, or hardware. Records from Avida, a table from MABE2, and an Overview, Design concepts, and Details description are read through that port and are not the product of this paper. An ESP32 port is implemented and is not one of the measurements below. A configuration string that would claim an ASME V&amp;V 40 pass is rejected. This tool does not issue an ASME, FDA, or IEC certificate. Viceconti and colleagues set an in silico trial on context, risk, and a verification chain [5]. Here that chain becomes a grade on one file, not a certificate for a product.</w:t>
       </w:r>
     </w:p>
     <w:p>
@@ -215,7 +215,7 @@
           <w:szCs w:val="20"/>
           <w:lang w:val="en-US" w:bidi="en-US"/>
         </w:rPr>
-        <w:t>MIRROR assembles a local evidence bundle for inspection before release and does not offer a regulatory guarantee [6]. NovaFabric records an agent run in a signed capsule and does not set a claim ceiling [7]. The difference here is a grade computed from the conditions present in the bundle.</w:t>
+        <w:t>MIRROR assembles a local evidence bundle for inspection before release and does not offer a regulatory guarantee [6]. NovaFabric records an agent run in a signed capsule [7]. The difference here is a grade computed from the conditions present in the bundle.</w:t>
       </w:r>
     </w:p>
     <w:p>
@@ -250,7 +250,7 @@
           <w:szCs w:val="20"/>
           <w:lang w:val="en-US" w:bidi="en-US"/>
         </w:rPr>
-        <w:t>The auditor reads the bundle. It does not call the engine. Each grade requires every condition of the grades below it. Grade 0 means that software identity, source digest, artifact, seed list, configuration fingerprint, artifact manifest, and run record are not all present. Grade 1 still lacks a paired treatment and control, a paired comparison, and a consistent measured difference. Grade 2 still lacks an intervention or a deletion, a negative control, verified replay, a direction of effect, and a written limitation with the artifact. Grade 3 still lacks a numeric interval or at least 16 seeds. Grade 4 has both. Grade 5 also requires an archive identifier separate from the software bundle. In this implementation the public name of grade 4 is replicated effect. Table 1 names only the new condition at each step.</w:t>
+        <w:t>The auditor reads the bundle. It does not call the engine. Each grade requires every condition of the grades below it. Grade 0 means that software identity, source digest, artifact, seed list, configuration fingerprint, artifact manifest, and run record are not all present. Grade 1 still lacks a paired treatment and control, a paired comparison, and a consistent measured difference. Grade 2 still lacks an intervention or a deletion, a negative control, verified replay, a direction of effect, and a written limitation with the artifact. Grade 3 still lacks a numeric interval or at least 16 seeds. Grade 4 has the interval and the seed count. Grade 5 also requires an archive identifier separate from the software bundle, a written limitation, and statistical evidence tied to a deletion. In this implementation the public name of grade 4 is replicated effect. Table 1 names the condition whose absence holds the grade in place.</w:t>
       </w:r>
     </w:p>
     <w:p>
@@ -314,7 +314,7 @@
                 <w:szCs w:val="16"/>
                 <w:lang w:val="en-US" w:bidi="en-US"/>
               </w:rPr>
-              <w:t>Held</w:t>
+              <w:t>Grade</w:t>
             </w:r>
           </w:p>
         </w:tc>
@@ -643,7 +643,7 @@
           <w:szCs w:val="20"/>
           <w:lang w:val="en-US" w:bidi="en-US"/>
         </w:rPr>
-        <w:t>Regulatory words on this port are labels, not grades. ASME VVUQ 40.1-2026 is a worked tibial-tray example, not a pass bit [8]. IEC 62304 assigns software safety class A, B, or C [9]. The International Medical Device Regulators Forum (IMDRF) fixes the wording for software in a medical device and for software as a medical device [10]. Recording that wording does not classify a product. If the model is not declared physics-based, the 2023 guidance places a standalone model outside that scope, and the note still does not raise the ladder.</w:t>
+        <w:t>Regulatory words on this port are labels, not grades. ASME VVUQ 40.1-2026 is a worked tibial-tray example, not a pass bit [8]. IEC 62304 assigns software safety class A, B, or C [9]. The International Medical Device Regulators Forum document N12 sets categories I to IV for software as a medical device [10]. Recording a category does not classify a product. If the model is declared not physics-based, the port records that the 2023 guidance places a standalone model outside that scope. The note does not raise the ladder.</w:t>
       </w:r>
     </w:p>
     <w:p>
@@ -660,7 +660,7 @@
           <w:szCs w:val="20"/>
           <w:lang w:val="en-US" w:bidi="en-US"/>
         </w:rPr>
-        <w:t>Phenomenon rank is taken from the nuclear-safety table: importance against knowledge [11]. High importance stays open unless knowledge is adequate and the row was measured. Medium importance is a gap only when knowledge is none. Low importance is screened out. A typed word, without a treatment arm, is not a measurement and does not close a high-importance gap. Table 2 is that rule. The cap on the weakest submodel follows the building-block rule [3]. A submodel that is not identifiable cannot contribute above 1. Evidence limited to calibration, plausibility, or emergent behavior, categories 2, 6, and 7 of the 2023 guidance, cannot contribute above 2. If a submodel was not executed, that cap is not reported as a measurement and does not move the claim grade.</w:t>
+        <w:t>Importance and knowledge are each scored on three levels, following Phenomena Identification and Ranking Table practice [11]. Table 2 is the gap rule on this port. It is not a result from the spent-fuel study in that report. High importance stays open unless knowledge is adequate and the row was measured. Medium importance is a gap only when knowledge is none. Low importance is screened out. A typed word, with no treatment arm, is not a measurement. On this port a coupled model does not rise above its weakest executed submodel. A submodel that is not identifiable cannot contribute above grade 1. Evidence limited to categories 2, 6, and 7 of the 2023 guidance, calibration, emergent behavior, and plausibility, cannot contribute above grade 2 [1]. If a submodel was not executed, that cap is not reported as a measurement and does not move the claim grade.</w:t>
       </w:r>
     </w:p>
     <w:p>
@@ -700,15 +700,15 @@
         <w:tblLayout w:type="fixed"/>
       </w:tblPr>
       <w:tblGrid>
+        <w:gridCol w:w="1300"/>
+        <w:gridCol w:w="1200"/>
+        <w:gridCol w:w="1100"/>
         <w:gridCol w:w="1000"/>
-        <w:gridCol w:w="1300"/>
-        <w:gridCol w:w="1100"/>
-        <w:gridCol w:w="1200"/>
       </w:tblGrid>
       <w:tr>
         <w:tc>
           <w:tcPr>
-            <w:tcW w:type="dxa" w:w="1000"/>
+            <w:tcW w:type="dxa" w:w="1300"/>
           </w:tcPr>
           <w:p>
             <w:pPr>
@@ -732,7 +732,7 @@
         </w:tc>
         <w:tc>
           <w:tcPr>
-            <w:tcW w:type="dxa" w:w="1300"/>
+            <w:tcW w:type="dxa" w:w="1200"/>
           </w:tcPr>
           <w:p>
             <w:pPr>
@@ -780,7 +780,7 @@
         </w:tc>
         <w:tc>
           <w:tcPr>
-            <w:tcW w:type="dxa" w:w="1200"/>
+            <w:tcW w:type="dxa" w:w="1000"/>
           </w:tcPr>
           <w:p>
             <w:pPr>
@@ -806,7 +806,7 @@
       <w:tr>
         <w:tc>
           <w:tcPr>
-            <w:tcW w:type="dxa" w:w="1000"/>
+            <w:tcW w:type="dxa" w:w="1300"/>
           </w:tcPr>
           <w:p>
             <w:pPr>
@@ -830,7 +830,7 @@
         </w:tc>
         <w:tc>
           <w:tcPr>
-            <w:tcW w:type="dxa" w:w="1300"/>
+            <w:tcW w:type="dxa" w:w="1200"/>
           </w:tcPr>
           <w:p>
             <w:pPr>
@@ -878,7 +878,7 @@
         </w:tc>
         <w:tc>
           <w:tcPr>
-            <w:tcW w:type="dxa" w:w="1200"/>
+            <w:tcW w:type="dxa" w:w="1000"/>
           </w:tcPr>
           <w:p>
             <w:pPr>
@@ -904,7 +904,7 @@
       <w:tr>
         <w:tc>
           <w:tcPr>
-            <w:tcW w:type="dxa" w:w="1000"/>
+            <w:tcW w:type="dxa" w:w="1300"/>
           </w:tcPr>
           <w:p>
             <w:pPr>
@@ -928,7 +928,7 @@
         </w:tc>
         <w:tc>
           <w:tcPr>
-            <w:tcW w:type="dxa" w:w="1300"/>
+            <w:tcW w:type="dxa" w:w="1200"/>
           </w:tcPr>
           <w:p>
             <w:pPr>
@@ -976,7 +976,7 @@
         </w:tc>
         <w:tc>
           <w:tcPr>
-            <w:tcW w:type="dxa" w:w="1200"/>
+            <w:tcW w:type="dxa" w:w="1000"/>
           </w:tcPr>
           <w:p>
             <w:pPr>
@@ -1002,7 +1002,7 @@
       <w:tr>
         <w:tc>
           <w:tcPr>
-            <w:tcW w:type="dxa" w:w="1000"/>
+            <w:tcW w:type="dxa" w:w="1300"/>
           </w:tcPr>
           <w:p>
             <w:pPr>
@@ -1026,7 +1026,7 @@
         </w:tc>
         <w:tc>
           <w:tcPr>
-            <w:tcW w:type="dxa" w:w="1300"/>
+            <w:tcW w:type="dxa" w:w="1200"/>
           </w:tcPr>
           <w:p>
             <w:pPr>
@@ -1074,7 +1074,7 @@
         </w:tc>
         <w:tc>
           <w:tcPr>
-            <w:tcW w:type="dxa" w:w="1200"/>
+            <w:tcW w:type="dxa" w:w="1000"/>
           </w:tcPr>
           <w:p>
             <w:pPr>
@@ -1100,7 +1100,7 @@
       <w:tr>
         <w:tc>
           <w:tcPr>
-            <w:tcW w:type="dxa" w:w="1000"/>
+            <w:tcW w:type="dxa" w:w="1300"/>
           </w:tcPr>
           <w:p>
             <w:pPr>
@@ -1124,7 +1124,7 @@
         </w:tc>
         <w:tc>
           <w:tcPr>
-            <w:tcW w:type="dxa" w:w="1300"/>
+            <w:tcW w:type="dxa" w:w="1200"/>
           </w:tcPr>
           <w:p>
             <w:pPr>
@@ -1172,7 +1172,7 @@
         </w:tc>
         <w:tc>
           <w:tcPr>
-            <w:tcW w:type="dxa" w:w="1200"/>
+            <w:tcW w:type="dxa" w:w="1000"/>
           </w:tcPr>
           <w:p>
             <w:pPr>
@@ -1198,7 +1198,7 @@
       <w:tr>
         <w:tc>
           <w:tcPr>
-            <w:tcW w:type="dxa" w:w="1000"/>
+            <w:tcW w:type="dxa" w:w="1300"/>
           </w:tcPr>
           <w:p>
             <w:pPr>
@@ -1222,7 +1222,7 @@
         </w:tc>
         <w:tc>
           <w:tcPr>
-            <w:tcW w:type="dxa" w:w="1300"/>
+            <w:tcW w:type="dxa" w:w="1200"/>
           </w:tcPr>
           <w:p>
             <w:pPr>
@@ -1270,7 +1270,7 @@
         </w:tc>
         <w:tc>
           <w:tcPr>
-            <w:tcW w:type="dxa" w:w="1200"/>
+            <w:tcW w:type="dxa" w:w="1000"/>
           </w:tcPr>
           <w:p>
             <w:pPr>
@@ -1296,7 +1296,7 @@
       <w:tr>
         <w:tc>
           <w:tcPr>
-            <w:tcW w:type="dxa" w:w="1000"/>
+            <w:tcW w:type="dxa" w:w="1300"/>
           </w:tcPr>
           <w:p>
             <w:pPr>
@@ -1320,7 +1320,7 @@
         </w:tc>
         <w:tc>
           <w:tcPr>
-            <w:tcW w:type="dxa" w:w="1300"/>
+            <w:tcW w:type="dxa" w:w="1200"/>
           </w:tcPr>
           <w:p>
             <w:pPr>
@@ -1368,7 +1368,7 @@
         </w:tc>
         <w:tc>
           <w:tcPr>
-            <w:tcW w:type="dxa" w:w="1200"/>
+            <w:tcW w:type="dxa" w:w="1000"/>
           </w:tcPr>
           <w:p>
             <w:pPr>
@@ -1424,7 +1424,7 @@
           <w:szCs w:val="20"/>
           <w:lang w:val="en-US" w:bidi="en-US"/>
         </w:rPr>
-        <w:t>The string intervention supported inside the file is internal grade 3. That name alone does not confer public grade 4. These thresholds belong to this implementation. They are not approval of a device.</w:t>
+        <w:t>In the results file, the label intervention_supported maps to internal grade 3. That name alone does not confer public grade 4. These thresholds belong to this implementation. They are not approval of a device.</w:t>
       </w:r>
     </w:p>
     <w:p>
@@ -1441,7 +1441,7 @@
           <w:szCs w:val="20"/>
           <w:lang w:val="en-US" w:bidi="en-US"/>
         </w:rPr>
-        <w:t>The positive control is the source-bias campaign HE01, replayable, with 30 paired seeds. The results file, fingerprint prefix 28f812c5, contains three comparisons. Against the open channel with no source bias, the difference is 16.49, the raw Monte Carlo p value is 4.99975e-5, the Holm p value is 1.50e-4, and the BCa interval is 14.25 to 19.14. The p value is a floor from 20,000 draws, not zero. The primary comparison changes two settings together: the source-fitness threshold moves from 1.5 to 0, and the acceptance policy moves from fitness-weighted to threshold. The difference 16.49 belongs to that pair of settings, not to either setting alone. Against the closed channel and against empty content the difference is 30.67 and the interval is 26.03 to 35.32. In those two contrasts, both content and bias change. The auditor returns grade 4 because replay, the interval, and the seed count hold.</w:t>
+        <w:t>The positive control is the source-bias campaign HE01, replayable, with 30 paired seeds. The results file, fingerprint prefix 28f812c5, contains three comparisons. Against the open channel with no source bias, the difference is 16.49, the raw Monte Carlo p value is 4.99975 × 10⁻⁵, the Holm p value is 1.50 × 10⁻⁴, and the BCa interval is 14.25 to 19.14. The p value is a floor from 20,000 draws, not zero. The primary comparison changes two settings together: the source-fitness threshold moves from 1.5 to 0, and the acceptance policy moves from fitness-weighted to threshold. The difference 16.49 belongs to that pair of settings, not to either setting alone. Against the closed channel and against empty content the difference is 30.67 and the interval is 26.03 to 35.32. In those two contrasts, both content and bias change. The auditor returns grade 4 because replay, the interval, and the seed count hold.</w:t>
       </w:r>
     </w:p>
     <w:p>
@@ -1458,7 +1458,7 @@
           <w:szCs w:val="20"/>
           <w:lang w:val="en-US" w:bidi="en-US"/>
         </w:rPr>
-        <w:t>The negative control is a declared score table for a device model. The question was whether a size choice would be licensed. There is no ISO 14879-1 test and no implant. Model influence is 2 and decision consequence is 3. Treatment scores are 0.12, 0.11, and 0.13. Control scores are 0.20, 0.19, and 0.21. The declared labels are software in a medical device, class B of IEC 62304 [9], category II of IMDRF [10], and evidence categories 1, 3, and 8 of the 2023 guidance, with the model declared as physics-based. Replay is not verified, and the artifact manifest is among the conditions for leaving grade 0, so the grade is 0. ASME VVUQ 40.1-2026 is a worked tibial-tray example, not a pass bit, and that example is not run here [8]. Table 3 records the distance between the two controls.</w:t>
+        <w:t>The negative control is a declared score table for a device model. The question was whether a size choice would be licensed. There is no ISO 14879-1 test and no implant. Model influence is 2 and decision consequence is 3. Treatment scores are 0.12, 0.11, and 0.13. Control scores are 0.20, 0.19, and 0.21. The declared labels are software in a medical device, class B of IEC 62304 [9], category II of IMDRF [10], and evidence categories 1, 3, and 8 of the 2023 guidance, with the model declared as physics-based. Replay is not verified, and the artifact manifest is among the conditions for leaving grade 0, so the grade is 0. That tibial-tray example is not run here [8]. Table 3 records the distance between the two controls.</w:t>
       </w:r>
     </w:p>
     <w:p>
@@ -1847,7 +1847,7 @@
           <w:szCs w:val="20"/>
           <w:lang w:val="en-US" w:bidi="en-US"/>
         </w:rPr>
-        <w:t>The credibility worksheet ranks a phenomenon. The rank alone does not close it. Closure requires the arm to be in the bundle, the role to be treatment, and the arm to be side A of a comparison whose interval bounds are both finite. The auditor must be at grade 4 or higher, and replay must be verified. If the phenomenon names a maximum interval width, the interval must be no wider. One arm closes one phenomenon. A second phenomenon on the same arm is marked shared and stays open. A rank with no arm stays declared.</w:t>
+        <w:t>The credibility worksheet ranks a phenomenon. The rank alone does not close it. Closure requires the arm to be in the bundle, the role to be treatment, and the arm to be the treatment side of a comparison whose interval bounds are both finite. The auditor must be at grade 4 or higher, and replay must be verified. If the phenomenon names a maximum interval width, the interval must be no wider. One arm closes one phenomenon. A second phenomenon on the same arm is marked shared and stays open. A rank with no arm stays declared.</w:t>
       </w:r>
     </w:p>
     <w:p>
@@ -1864,7 +1864,7 @@
           <w:szCs w:val="20"/>
           <w:lang w:val="en-US" w:bidi="en-US"/>
         </w:rPr>
-        <w:t>On the study bound to HE01, source-fitness bias and the life-loop campaign both close. The life loop is a campaign, not a device, and it carries no FDA evidence category. Contact stress and patient geometry stay declared. Patient geometry remains at a usable level of 2. Because not every submodel was executed, the coupled ceiling is empty. The claim grade of the campaign is still 4. The primary interval is about 4.89 wide. A tolerance of 1.0 does not close source bias. A tolerance of 6.0 does. A closed channel is not a treatment arm. Two submodels that share a configuration fingerprint are not independent and do not form a ceiling. Two replayed bundles at grade 4 with different fingerprints can set a ceiling of 4, and that ceiling does not change the public grade. The ranking is the phenomena identification and ranking table used in nuclear safety [11]. A high-importance row stays open unless knowledge is adequate and the row was measured. A submodel that is not identifiable cannot contribute above 1. Evidence limited to calibration, plausibility, or emergent behavior, categories 2, 6, and 7 of the 2023 guidance, cannot contribute above 2 [1], [3].</w:t>
+        <w:t>On the study bound to HE01, source-fitness bias and the life-loop campaign both close. The life loop is a campaign, not a device, and it carries no FDA evidence category. Contact stress and patient geometry stay declared. Patient geometry remains at a usable level of 2. Because not every submodel was executed, the coupled ceiling is empty. The claim grade of the campaign is still 4. The primary interval is about 4.89 wide. A tolerance of 1.0 does not close source bias. A tolerance of 6.0 does. A closed channel is not a treatment arm. Two submodels that share a configuration fingerprint are not independent and do not form a ceiling. In a separate check, two replayed bundles at grade 4 with different fingerprints can set a ceiling of 4, and that ceiling does not change the public grade. The gap rule is Table 2.</w:t>
       </w:r>
     </w:p>
     <w:p>
@@ -2780,7 +2780,7 @@
           <w:szCs w:val="20"/>
           <w:lang w:val="en-US" w:bidi="en-US"/>
         </w:rPr>
-        <w:t>The intact reference is grade 4. Six bundles were built by removing one condition, and all six stayed below 4. Identical arms, a zero-width interval, and an unpaired comparison stay at grade 1. Missing replay, and an empty limitation, stay at grade 2. Three seeds stay at grade 3. The six bundles are not an independent random sample, so no binomial interval and no false-accept rate are reported. The count is not a percentage of papers. Table 6 lists the grades. A separate row changes the label of a sensitivity arm and still receives grade 4, because a confirmatory negative-control arm is still in the bundle. The row is a probe, not an escape trial. The deletion file prefix is 3c8a8a1f.</w:t>
+        <w:t>The intact reference is grade 4. Six bundles were built by removing one condition, and all six stayed below 4. Identical arms, a zero-width interval, and an unpaired comparison stay at grade 1. Missing replay, and an empty limitation, stay at grade 2. Three seeds stay at grade 3. The six bundles are not an independent random sample, so no binomial interval and no false-accept rate are reported. The count is not a percentage of papers. Table 6 lists the grades. A separate row changes the label of a sensitivity arm and still receives grade 4, because a confirmatory negative-control arm is still in the bundle. The row is a probe, not an escape trial.</w:t>
       </w:r>
     </w:p>
     <w:p>
@@ -3520,7 +3520,7 @@
                 <w:szCs w:val="16"/>
                 <w:lang w:val="en-US" w:bidi="en-US"/>
               </w:rPr>
-              <w:t>Matched content</w:t>
+              <w:t>Shuffled capsules</w:t>
             </w:r>
           </w:p>
         </w:tc>
@@ -3664,7 +3664,7 @@
           <w:szCs w:val="20"/>
           <w:lang w:val="en-US" w:bidi="en-US"/>
         </w:rPr>
-        <w:t>The difference 16.49 sets treatment against removal of the mechanism, and both settings change together. The difference 30.67 is the same number for the closed channel and for empty content, and those two baselines share one value fingerprint. The width of the first interval is 19.135 minus 14.249, about 4.89. An optional studentized interval on the same 30 differences runs from about 14.05 to 19.30 and leaves the results file unchanged. Each deletion stops at the rung that owns the removed condition. Identical arms, a zero-width interval, and an unpaired comparison do not leave grade 1. Missing replay, and an empty limitation, stay at grade 2. Three seeds pass the interval and stay at grade 3, because 16 seeds are the condition for grade 4. The role-change probe was kept out of the six, and no rate was built from it. A hash of the word placeholder is a valid digest and is not rejected on its own. The study file prefix is d176f0ab and the deletion-file prefix is 3c8a8a1f. Both files were produced by running the auditor.</w:t>
+        <w:t>The difference 16.49 sets treatment against removal of the mechanism, and both settings change together. The difference 30.67 is the same number for the channel-off arm and for empty content, and those two baselines share one value fingerprint. The width of the first interval is 19.135 minus 14.249, about 4.89. An optional studentized interval on the same 30 differences runs from about 14.05 to 19.30 and does not alter the results file. The study file prefix is d176f0ab and the deletion-file prefix is 3c8a8a1f. Both files were produced by running the auditor. The six deletions in Table 6 stop at the rung that owns the removed condition, and the role-change probe was kept out of that count.</w:t>
       </w:r>
     </w:p>
     <w:p>
@@ -3733,7 +3733,7 @@
           <w:szCs w:val="20"/>
           <w:lang w:val="en-US" w:bidi="en-US"/>
         </w:rPr>
-        <w:t>Configuration rejects strings that would claim FDA clearance, clinical validation, IEC 62304 certification, or an ASME V&amp;V 40 pass. Rejection is not an audit grade. Four observations can be repeated from the committed files. The campaign audit returns grade 4, and grade 5 lacks only a separate archive identifier. The device table returns grade 0. The committed study and the deletion file match the live auditor. On HE01 the risk bar leaves grade 4 unchanged. The study fingerprint prefix is d176f0ab. The graded files were read at repository commit c8db778. The package identity in the project configuration is 0.3.0b7, which is not a PyPI release. The published tip is 0.3.0b6. The DOI named above is the software archive, not the campaign archive.</w:t>
+        <w:t>Configuration rejects strings that would claim FDA clearance, clinical validation, IEC 62304 certification, or an ASME V&amp;V 40 pass. Rejection is not an audit grade. Four observations can be repeated from the committed files. The campaign audit returns grade 4, and grade 5 lacks only a separate archive identifier. The device table returns grade 0. The committed study and the deletion file match the live auditor. On HE01 the risk bar leaves grade 4 unchanged. The study fingerprint prefix is d176f0ab. The three graded files were committed at c8db778, and those digests are unchanged. The package identity in the project configuration is 0.3.0b7, which is not a PyPI release. The published tip is 0.3.0b6. The DOI named above is the software archive, not the campaign archive.</w:t>
       </w:r>
     </w:p>
     <w:p>
@@ -3839,7 +3839,7 @@
           <w:szCs w:val="16"/>
           <w:lang w:val="en-US" w:bidi="en-US"/>
         </w:rPr>
-        <w:t>U.S. Food and Drug Administration, “Assessing the credibility of computational modeling and simulation in medical device submissions,” Nov. 2023.</w:t>
+        <w:t>U.S. Food and Drug Administration, “Assessing the credibility of computational modeling and simulation in medical device submissions,” Guidance for Industry and FDA Staff, Nov. 17, 2023.</w:t>
       </w:r>
     </w:p>
     <w:p>
@@ -3875,7 +3875,7 @@
           <w:szCs w:val="16"/>
           <w:lang w:val="en-US" w:bidi="en-US"/>
         </w:rPr>
-        <w:t>NASA-STD-7009B, Standard for Models and Simulations. Washington, DC: NASA, Mar. 5, 2024.</w:t>
+        <w:t>NASA-STD-7009B, Standard for Models and Simulations. Washington, DC: NASA, approved Mar. 5, 2024.</w:t>
       </w:r>
     </w:p>
     <w:p>
@@ -3893,7 +3893,7 @@
           <w:szCs w:val="16"/>
           <w:lang w:val="en-US" w:bidi="en-US"/>
         </w:rPr>
-        <w:t>P. Pathmanathan, K. Aycock, A. Badal, R. Bighamian, J. Bodner, B. A. Craven, and S. Niederer, “Credibility assessment of in silico clinical trials for medical devices,” PLoS Comput. Biol., vol. 20, no. 8, Art. no. e1012289, Aug. 2024.</w:t>
+        <w:t>P. Pathmanathan, K. Aycock, A. Badal, R. Bighamian, J. Bodner, B. A. Craven, and S. Niederer, “Credibility assessment of in silico clinical trials for medical devices,” PLoS Comput. Biol., vol. 20, no. 8, Art. no. e1012289, Aug. 2024, doi: 10.1371/journal.pcbi.1012289.</w:t>
       </w:r>
     </w:p>
     <w:p>
@@ -3911,7 +3911,7 @@
           <w:szCs w:val="16"/>
           <w:lang w:val="en-US" w:bidi="en-US"/>
         </w:rPr>
-        <w:t>M. Viceconti, F. Pappalardo, B. Rodriguez, M. Horner, J. Bischoff, and F. Musuamba Tshinanu, “In silico trials: verification, validation and uncertainty quantification of predictive models used in the regulatory evaluation of biomedical products,” Methods, vol. 185, pp. 120-127, 2021.</w:t>
+        <w:t>M. Viceconti, F. Pappalardo, B. Rodriguez, M. Horner, J. Bischoff, and F. Musuamba Tshinanu, “In silico trials: verification, validation and uncertainty quantification of predictive models used in the regulatory evaluation of biomedical products,” Methods, vol. 185, pp. 120-127, Jan. 2021, doi: 10.1016/j.ymeth.2020.01.011.</w:t>
       </w:r>
     </w:p>
     <w:p>
@@ -3929,7 +3929,7 @@
           <w:szCs w:val="16"/>
           <w:lang w:val="en-US" w:bidi="en-US"/>
         </w:rPr>
-        <w:t>A. Sokolov, “MIRROR: local evidence bundles for reproducible research software review,” Zenodo, May 2026, doi: 10.5281/zenodo.20463358.</w:t>
+        <w:t>Anton Sokolov, “MIRROR: local evidence bundles for reproducible research software review,” Zenodo, May 30, 2026, doi: 10.5281/zenodo.20463358.</w:t>
       </w:r>
     </w:p>
     <w:p>
@@ -3947,7 +3947,7 @@
           <w:szCs w:val="16"/>
           <w:lang w:val="en-US" w:bidi="en-US"/>
         </w:rPr>
-        <w:t>M. Seyedkazemi Ardebili, “NovaFabric: tamper-evident, replayable evidence for autonomous AI agent runs,” arXiv:2609.12582, 2026.</w:t>
+        <w:t>M. Seyedkazemi Ardebili, “NovaFabric: tamper-evident, replayable evidence for autonomous AI agent runs,” arXiv:2609.12582, Sep. 11, 2026, doi: 10.48550/arXiv.2609.12582.</w:t>
       </w:r>
     </w:p>
     <w:p>
@@ -3965,7 +3965,7 @@
           <w:szCs w:val="16"/>
           <w:lang w:val="en-US" w:bidi="en-US"/>
         </w:rPr>
-        <w:t>Tibial Tray Worst-Case Size Identification for Fatigue Testing, ASME VVUQ 40.1-2026. New York: ASME, 2026.</w:t>
+        <w:t>An Example of Assessing Computational Model Credibility Using the ASME V&amp;V 40 Risk-Based Framework: Tibial Tray Component Worst-Case Size Identification for Fatigue Testing, ASME VVUQ 40.1-2026. New York: ASME, 2026.</w:t>
       </w:r>
     </w:p>
     <w:p>
@@ -3983,7 +3983,7 @@
           <w:szCs w:val="16"/>
           <w:lang w:val="en-US" w:bidi="en-US"/>
         </w:rPr>
-        <w:t>IEC 62304:2006+AMD1:2015, Medical device software, Software life cycle processes. Geneva: IEC.</w:t>
+        <w:t>IEC 62304:2006+AMD1:2015, Medical device software, Software life cycle processes. Geneva: IEC, 2015.</w:t>
       </w:r>
     </w:p>
     <w:p>
@@ -4001,7 +4001,7 @@
           <w:szCs w:val="16"/>
           <w:lang w:val="en-US" w:bidi="en-US"/>
         </w:rPr>
-        <w:t>Software as a Medical Device: Possible Framework for Risk Categorization and Characterization Considerations, IMDRF/SaMD WG/N12 and N81.</w:t>
+        <w:t>IMDRF/SaMD WG/N12FINAL:2014, “Software as a Medical Device”: Possible Framework for Risk Categorization and Corresponding Considerations. IMDRF, 2014.</w:t>
       </w:r>
     </w:p>
     <w:p>
@@ -4019,7 +4019,7 @@
           <w:szCs w:val="16"/>
           <w:lang w:val="en-US" w:bidi="en-US"/>
         </w:rPr>
-        <w:t>Phenomena Identification and Ranking Table, NEA/CSNI/R(2017)18. Paris: OECD Nuclear Energy Agency, 2018.</w:t>
+        <w:t>Nuclear Energy Agency, Phenomena Identification and Ranking Table: R&amp;D Priorities for Loss-of-Cooling and Loss-of-Coolant Accidents in Spent Nuclear Fuel Pools, NEA/CSNI/R(2017)18. Paris: OECD, 2018.</w:t>
       </w:r>
     </w:p>
     <w:p>
@@ -4037,7 +4037,7 @@
           <w:szCs w:val="16"/>
           <w:lang w:val="en-US" w:bidi="en-US"/>
         </w:rPr>
-        <w:t>S. H. Hurlbert, “Pseudoreplication and the design of ecological field experiments,” Ecological Monographs, vol. 54, no. 2, pp. 187-211, 1984.</w:t>
+        <w:t>S. H. Hurlbert, “Pseudoreplication and the design of ecological field experiments,” Ecological Monographs, vol. 54, no. 2, pp. 187-211, 1984, doi: 10.2307/1942661.</w:t>
       </w:r>
     </w:p>
     <w:sectPr>

</xml_diff>

<commit_message>
docs(baic): fill the last page with refused strings and checkable files
The English manuscript stays at four pages. It records four certificate
strings the biomedical profile refuses, the three committed result files,
and that the ESP32 adapter is a stub with no robot result.
</commit_message>
<xml_diff>
--- a/paper/baic/BAIC2026_Jamei_en.docx
+++ b/paper/baic/BAIC2026_Jamei_en.docx
@@ -3769,6 +3769,704 @@
           <w:lang w:val="en-US" w:bidi="en-US"/>
         </w:rPr>
         <w:t>A file label, an IEC 62304 class, an IMDRF phrase, a typed knowledge word, and a declared risk do not raise the audit grade. The campaign file reaches grade 4 because replay and an interval on 30 seeds hold. The table with no recorded run stays at grade 0. The same grade 4 meets the risk-3 bar when the listed phenomenon was executed, and it does not meet that bar when a high-importance phenomenon is only declared. Six requirement deletions stay below grade 4, and the count is not a literature rate.</w:t>
+      </w:r>
+    </w:p>
+    <w:p>
+      <w:pPr>
+        <w:pStyle w:val="Heading1"/>
+        <w:bidi w:val="0"/>
+        <w:jc w:val="left"/>
+      </w:pPr>
+      <w:r>
+        <w:rPr>
+          <w:rFonts w:ascii="Times New Roman" w:hAnsi="Times New Roman" w:cs="Times New Roman" w:eastAsia="Times New Roman"/>
+          <w:b/>
+          <w:i w:val="0"/>
+          <w:sz w:val="24"/>
+          <w:szCs w:val="24"/>
+          <w:lang w:val="en-US" w:bidi="en-US"/>
+        </w:rPr>
+        <w:t>Refused strings and recorded files</w:t>
+      </w:r>
+    </w:p>
+    <w:p>
+      <w:pPr>
+        <w:bidi w:val="0"/>
+        <w:jc w:val="both"/>
+      </w:pPr>
+      <w:r>
+        <w:rPr>
+          <w:rFonts w:ascii="Times New Roman" w:hAnsi="Times New Roman" w:cs="Times New Roman" w:eastAsia="Times New Roman"/>
+          <w:b w:val="0"/>
+          <w:i w:val="0"/>
+          <w:sz w:val="20"/>
+          <w:szCs w:val="20"/>
+          <w:lang w:val="en-US" w:bidi="en-US"/>
+        </w:rPr>
+        <w:t>The biomedical profile refuses a string that would be a certificate. Refusal is not an audit grade. Table 8 lists four of those strings. The same profile still accepts a declared label, such as an IEC class or an IMDRF category, and that label does not raise the grade.</w:t>
+      </w:r>
+    </w:p>
+    <w:p>
+      <w:pPr>
+        <w:pStyle w:val="Caption"/>
+        <w:keepNext/>
+        <w:bidi w:val="0"/>
+        <w:jc w:val="center"/>
+      </w:pPr>
+      <w:r>
+        <w:rPr>
+          <w:rFonts w:ascii="Times New Roman" w:hAnsi="Times New Roman" w:cs="Times New Roman" w:eastAsia="Times New Roman"/>
+          <w:b/>
+          <w:i w:val="0"/>
+          <w:sz w:val="16"/>
+          <w:szCs w:val="16"/>
+          <w:lang w:val="en-US" w:bidi="en-US"/>
+        </w:rPr>
+        <w:t>Table 8. Strings the configuration refuses</w:t>
+      </w:r>
+    </w:p>
+    <w:tbl>
+      <w:tblPr>
+        <w:tblW w:type="auto" w:w="0"/>
+        <w:jc w:val="center"/>
+        <w:tblLayout w:type="fixed"/>
+        <w:tblLook w:firstColumn="1" w:firstRow="1" w:lastColumn="0" w:lastRow="0" w:noHBand="0" w:noVBand="1" w:val="04A0"/>
+        <w:tblBorders>
+          <w:top w:val="single" w:sz="4" w:space="0" w:color="000000"/>
+          <w:left w:val="single" w:sz="4" w:space="0" w:color="000000"/>
+          <w:bottom w:val="single" w:sz="4" w:space="0" w:color="000000"/>
+          <w:right w:val="single" w:sz="4" w:space="0" w:color="000000"/>
+          <w:insideH w:val="single" w:sz="4" w:space="0" w:color="000000"/>
+          <w:insideV w:val="single" w:sz="4" w:space="0" w:color="000000"/>
+        </w:tblBorders>
+        <w:tblW w:w="4600" w:type="dxa"/>
+        <w:tblLayout w:type="fixed"/>
+      </w:tblPr>
+      <w:tblGrid>
+        <w:gridCol w:w="2800"/>
+        <w:gridCol w:w="1800"/>
+      </w:tblGrid>
+      <w:tr>
+        <w:tc>
+          <w:tcPr>
+            <w:tcW w:type="dxa" w:w="2800"/>
+          </w:tcPr>
+          <w:p>
+            <w:pPr>
+              <w:bidi w:val="0"/>
+              <w:jc w:val="center"/>
+              <w:ind w:left="0" w:right="0" w:firstLine="0" w:hanging="0"/>
+            </w:pPr>
+            <w:r/>
+            <w:r>
+              <w:rPr>
+                <w:rFonts w:ascii="Times New Roman" w:hAnsi="Times New Roman" w:cs="Times New Roman" w:eastAsia="Times New Roman"/>
+                <w:b/>
+                <w:i w:val="0"/>
+                <w:sz w:val="16"/>
+                <w:szCs w:val="16"/>
+                <w:lang w:val="en-US" w:bidi="en-US"/>
+              </w:rPr>
+              <w:t>String</w:t>
+            </w:r>
+          </w:p>
+        </w:tc>
+        <w:tc>
+          <w:tcPr>
+            <w:tcW w:type="dxa" w:w="1800"/>
+          </w:tcPr>
+          <w:p>
+            <w:pPr>
+              <w:bidi w:val="0"/>
+              <w:jc w:val="center"/>
+              <w:ind w:left="0" w:right="0" w:firstLine="0" w:hanging="0"/>
+            </w:pPr>
+            <w:r/>
+            <w:r>
+              <w:rPr>
+                <w:rFonts w:ascii="Times New Roman" w:hAnsi="Times New Roman" w:cs="Times New Roman" w:eastAsia="Times New Roman"/>
+                <w:b/>
+                <w:i w:val="0"/>
+                <w:sz w:val="16"/>
+                <w:szCs w:val="16"/>
+                <w:lang w:val="en-US" w:bidi="en-US"/>
+              </w:rPr>
+              <w:t>Result</w:t>
+            </w:r>
+          </w:p>
+        </w:tc>
+      </w:tr>
+      <w:tr>
+        <w:tc>
+          <w:tcPr>
+            <w:tcW w:type="dxa" w:w="2800"/>
+          </w:tcPr>
+          <w:p>
+            <w:pPr>
+              <w:bidi w:val="0"/>
+              <w:jc w:val="both"/>
+              <w:ind w:left="0" w:right="0" w:firstLine="0" w:hanging="0"/>
+            </w:pPr>
+            <w:r/>
+            <w:r>
+              <w:rPr>
+                <w:rFonts w:ascii="Times New Roman" w:hAnsi="Times New Roman" w:cs="Times New Roman" w:eastAsia="Times New Roman"/>
+                <w:b w:val="0"/>
+                <w:i w:val="0"/>
+                <w:sz w:val="16"/>
+                <w:szCs w:val="16"/>
+                <w:lang w:val="en-US" w:bidi="en-US"/>
+              </w:rPr>
+              <w:t>fda_cleared</w:t>
+            </w:r>
+          </w:p>
+        </w:tc>
+        <w:tc>
+          <w:tcPr>
+            <w:tcW w:type="dxa" w:w="1800"/>
+          </w:tcPr>
+          <w:p>
+            <w:pPr>
+              <w:bidi w:val="0"/>
+              <w:jc w:val="both"/>
+              <w:ind w:left="0" w:right="0" w:firstLine="0" w:hanging="0"/>
+            </w:pPr>
+            <w:r/>
+            <w:r>
+              <w:rPr>
+                <w:rFonts w:ascii="Times New Roman" w:hAnsi="Times New Roman" w:cs="Times New Roman" w:eastAsia="Times New Roman"/>
+                <w:b w:val="0"/>
+                <w:i w:val="0"/>
+                <w:sz w:val="16"/>
+                <w:szCs w:val="16"/>
+                <w:lang w:val="en-US" w:bidi="en-US"/>
+              </w:rPr>
+              <w:t>Refused</w:t>
+            </w:r>
+          </w:p>
+        </w:tc>
+      </w:tr>
+      <w:tr>
+        <w:tc>
+          <w:tcPr>
+            <w:tcW w:type="dxa" w:w="2800"/>
+          </w:tcPr>
+          <w:p>
+            <w:pPr>
+              <w:bidi w:val="0"/>
+              <w:jc w:val="both"/>
+              <w:ind w:left="0" w:right="0" w:firstLine="0" w:hanging="0"/>
+            </w:pPr>
+            <w:r/>
+            <w:r>
+              <w:rPr>
+                <w:rFonts w:ascii="Times New Roman" w:hAnsi="Times New Roman" w:cs="Times New Roman" w:eastAsia="Times New Roman"/>
+                <w:b w:val="0"/>
+                <w:i w:val="0"/>
+                <w:sz w:val="16"/>
+                <w:szCs w:val="16"/>
+                <w:lang w:val="en-US" w:bidi="en-US"/>
+              </w:rPr>
+              <w:t>clinical_validated</w:t>
+            </w:r>
+          </w:p>
+        </w:tc>
+        <w:tc>
+          <w:tcPr>
+            <w:tcW w:type="dxa" w:w="1800"/>
+          </w:tcPr>
+          <w:p>
+            <w:pPr>
+              <w:bidi w:val="0"/>
+              <w:jc w:val="both"/>
+              <w:ind w:left="0" w:right="0" w:firstLine="0" w:hanging="0"/>
+            </w:pPr>
+            <w:r/>
+            <w:r>
+              <w:rPr>
+                <w:rFonts w:ascii="Times New Roman" w:hAnsi="Times New Roman" w:cs="Times New Roman" w:eastAsia="Times New Roman"/>
+                <w:b w:val="0"/>
+                <w:i w:val="0"/>
+                <w:sz w:val="16"/>
+                <w:szCs w:val="16"/>
+                <w:lang w:val="en-US" w:bidi="en-US"/>
+              </w:rPr>
+              <w:t>Refused</w:t>
+            </w:r>
+          </w:p>
+        </w:tc>
+      </w:tr>
+      <w:tr>
+        <w:tc>
+          <w:tcPr>
+            <w:tcW w:type="dxa" w:w="2800"/>
+          </w:tcPr>
+          <w:p>
+            <w:pPr>
+              <w:bidi w:val="0"/>
+              <w:jc w:val="both"/>
+              <w:ind w:left="0" w:right="0" w:firstLine="0" w:hanging="0"/>
+            </w:pPr>
+            <w:r/>
+            <w:r>
+              <w:rPr>
+                <w:rFonts w:ascii="Times New Roman" w:hAnsi="Times New Roman" w:cs="Times New Roman" w:eastAsia="Times New Roman"/>
+                <w:b w:val="0"/>
+                <w:i w:val="0"/>
+                <w:sz w:val="16"/>
+                <w:szCs w:val="16"/>
+                <w:lang w:val="en-US" w:bidi="en-US"/>
+              </w:rPr>
+              <w:t>iec_62304_certified</w:t>
+            </w:r>
+          </w:p>
+        </w:tc>
+        <w:tc>
+          <w:tcPr>
+            <w:tcW w:type="dxa" w:w="1800"/>
+          </w:tcPr>
+          <w:p>
+            <w:pPr>
+              <w:bidi w:val="0"/>
+              <w:jc w:val="both"/>
+              <w:ind w:left="0" w:right="0" w:firstLine="0" w:hanging="0"/>
+            </w:pPr>
+            <w:r/>
+            <w:r>
+              <w:rPr>
+                <w:rFonts w:ascii="Times New Roman" w:hAnsi="Times New Roman" w:cs="Times New Roman" w:eastAsia="Times New Roman"/>
+                <w:b w:val="0"/>
+                <w:i w:val="0"/>
+                <w:sz w:val="16"/>
+                <w:szCs w:val="16"/>
+                <w:lang w:val="en-US" w:bidi="en-US"/>
+              </w:rPr>
+              <w:t>Refused</w:t>
+            </w:r>
+          </w:p>
+        </w:tc>
+      </w:tr>
+      <w:tr>
+        <w:tc>
+          <w:tcPr>
+            <w:tcW w:type="dxa" w:w="2800"/>
+          </w:tcPr>
+          <w:p>
+            <w:pPr>
+              <w:bidi w:val="0"/>
+              <w:jc w:val="both"/>
+              <w:ind w:left="0" w:right="0" w:firstLine="0" w:hanging="0"/>
+            </w:pPr>
+            <w:r/>
+            <w:r>
+              <w:rPr>
+                <w:rFonts w:ascii="Times New Roman" w:hAnsi="Times New Roman" w:cs="Times New Roman" w:eastAsia="Times New Roman"/>
+                <w:b w:val="0"/>
+                <w:i w:val="0"/>
+                <w:sz w:val="16"/>
+                <w:szCs w:val="16"/>
+                <w:lang w:val="en-US" w:bidi="en-US"/>
+              </w:rPr>
+              <w:t>asme_vv40_passed</w:t>
+            </w:r>
+          </w:p>
+        </w:tc>
+        <w:tc>
+          <w:tcPr>
+            <w:tcW w:type="dxa" w:w="1800"/>
+          </w:tcPr>
+          <w:p>
+            <w:pPr>
+              <w:bidi w:val="0"/>
+              <w:jc w:val="both"/>
+              <w:ind w:left="0" w:right="0" w:firstLine="0" w:hanging="0"/>
+            </w:pPr>
+            <w:r/>
+            <w:r>
+              <w:rPr>
+                <w:rFonts w:ascii="Times New Roman" w:hAnsi="Times New Roman" w:cs="Times New Roman" w:eastAsia="Times New Roman"/>
+                <w:b w:val="0"/>
+                <w:i w:val="0"/>
+                <w:sz w:val="16"/>
+                <w:szCs w:val="16"/>
+                <w:lang w:val="en-US" w:bidi="en-US"/>
+              </w:rPr>
+              <w:t>Refused</w:t>
+            </w:r>
+          </w:p>
+        </w:tc>
+      </w:tr>
+    </w:tbl>
+    <w:p>
+      <w:pPr>
+        <w:bidi w:val="0"/>
+        <w:jc w:val="both"/>
+      </w:pPr>
+      <w:r>
+        <w:rPr>
+          <w:rFonts w:ascii="Times New Roman" w:hAnsi="Times New Roman" w:cs="Times New Roman" w:eastAsia="Times New Roman"/>
+          <w:b w:val="0"/>
+          <w:i w:val="0"/>
+          <w:sz w:val="20"/>
+          <w:szCs w:val="20"/>
+          <w:lang w:val="en-US" w:bidi="en-US"/>
+        </w:rPr>
+        <w:t>A reader can repeat three files. Table 9 gives the fingerprint prefix of each. The auditor writes the file. The three files were committed at c8db778, and those digests are unchanged. Code is at github.com/Parvaz-Jamei/codontrace-genesis. The package identity is 0.3.0b7 and is not a PyPI release. The published tip is 0.3.0b6. The DOI 10.5281/zenodo.20337435 archives the software, not the campaign.</w:t>
+      </w:r>
+    </w:p>
+    <w:p>
+      <w:pPr>
+        <w:pStyle w:val="Caption"/>
+        <w:keepNext/>
+        <w:bidi w:val="0"/>
+        <w:jc w:val="center"/>
+      </w:pPr>
+      <w:r>
+        <w:rPr>
+          <w:rFonts w:ascii="Times New Roman" w:hAnsi="Times New Roman" w:cs="Times New Roman" w:eastAsia="Times New Roman"/>
+          <w:b/>
+          <w:i w:val="0"/>
+          <w:sz w:val="16"/>
+          <w:szCs w:val="16"/>
+          <w:lang w:val="en-US" w:bidi="en-US"/>
+        </w:rPr>
+        <w:t>Table 9. Files a reader can check</w:t>
+      </w:r>
+    </w:p>
+    <w:tbl>
+      <w:tblPr>
+        <w:tblW w:type="auto" w:w="0"/>
+        <w:jc w:val="center"/>
+        <w:tblLayout w:type="fixed"/>
+        <w:tblLook w:firstColumn="1" w:firstRow="1" w:lastColumn="0" w:lastRow="0" w:noHBand="0" w:noVBand="1" w:val="04A0"/>
+        <w:tblBorders>
+          <w:top w:val="single" w:sz="4" w:space="0" w:color="000000"/>
+          <w:left w:val="single" w:sz="4" w:space="0" w:color="000000"/>
+          <w:bottom w:val="single" w:sz="4" w:space="0" w:color="000000"/>
+          <w:right w:val="single" w:sz="4" w:space="0" w:color="000000"/>
+          <w:insideH w:val="single" w:sz="4" w:space="0" w:color="000000"/>
+          <w:insideV w:val="single" w:sz="4" w:space="0" w:color="000000"/>
+        </w:tblBorders>
+        <w:tblW w:w="4600" w:type="dxa"/>
+        <w:tblLayout w:type="fixed"/>
+      </w:tblPr>
+      <w:tblGrid>
+        <w:gridCol w:w="1400"/>
+        <w:gridCol w:w="1400"/>
+        <w:gridCol w:w="1800"/>
+      </w:tblGrid>
+      <w:tr>
+        <w:tc>
+          <w:tcPr>
+            <w:tcW w:type="dxa" w:w="1400"/>
+          </w:tcPr>
+          <w:p>
+            <w:pPr>
+              <w:bidi w:val="0"/>
+              <w:jc w:val="center"/>
+              <w:ind w:left="0" w:right="0" w:firstLine="0" w:hanging="0"/>
+            </w:pPr>
+            <w:r/>
+            <w:r>
+              <w:rPr>
+                <w:rFonts w:ascii="Times New Roman" w:hAnsi="Times New Roman" w:cs="Times New Roman" w:eastAsia="Times New Roman"/>
+                <w:b/>
+                <w:i w:val="0"/>
+                <w:sz w:val="16"/>
+                <w:szCs w:val="16"/>
+                <w:lang w:val="en-US" w:bidi="en-US"/>
+              </w:rPr>
+              <w:t>File</w:t>
+            </w:r>
+          </w:p>
+        </w:tc>
+        <w:tc>
+          <w:tcPr>
+            <w:tcW w:type="dxa" w:w="1400"/>
+          </w:tcPr>
+          <w:p>
+            <w:pPr>
+              <w:bidi w:val="0"/>
+              <w:jc w:val="center"/>
+              <w:ind w:left="0" w:right="0" w:firstLine="0" w:hanging="0"/>
+            </w:pPr>
+            <w:r/>
+            <w:r>
+              <w:rPr>
+                <w:rFonts w:ascii="Times New Roman" w:hAnsi="Times New Roman" w:cs="Times New Roman" w:eastAsia="Times New Roman"/>
+                <w:b/>
+                <w:i w:val="0"/>
+                <w:sz w:val="16"/>
+                <w:szCs w:val="16"/>
+                <w:lang w:val="en-US" w:bidi="en-US"/>
+              </w:rPr>
+              <w:t>Prefix</w:t>
+            </w:r>
+          </w:p>
+        </w:tc>
+        <w:tc>
+          <w:tcPr>
+            <w:tcW w:type="dxa" w:w="1800"/>
+          </w:tcPr>
+          <w:p>
+            <w:pPr>
+              <w:bidi w:val="0"/>
+              <w:jc w:val="center"/>
+              <w:ind w:left="0" w:right="0" w:firstLine="0" w:hanging="0"/>
+            </w:pPr>
+            <w:r/>
+            <w:r>
+              <w:rPr>
+                <w:rFonts w:ascii="Times New Roman" w:hAnsi="Times New Roman" w:cs="Times New Roman" w:eastAsia="Times New Roman"/>
+                <w:b/>
+                <w:i w:val="0"/>
+                <w:sz w:val="16"/>
+                <w:szCs w:val="16"/>
+                <w:lang w:val="en-US" w:bidi="en-US"/>
+              </w:rPr>
+              <w:t>Record</w:t>
+            </w:r>
+          </w:p>
+        </w:tc>
+      </w:tr>
+      <w:tr>
+        <w:tc>
+          <w:tcPr>
+            <w:tcW w:type="dxa" w:w="1400"/>
+          </w:tcPr>
+          <w:p>
+            <w:pPr>
+              <w:bidi w:val="0"/>
+              <w:jc w:val="both"/>
+              <w:ind w:left="0" w:right="0" w:firstLine="0" w:hanging="0"/>
+            </w:pPr>
+            <w:r/>
+            <w:r>
+              <w:rPr>
+                <w:rFonts w:ascii="Times New Roman" w:hAnsi="Times New Roman" w:cs="Times New Roman" w:eastAsia="Times New Roman"/>
+                <w:b w:val="0"/>
+                <w:i w:val="0"/>
+                <w:sz w:val="16"/>
+                <w:szCs w:val="16"/>
+                <w:lang w:val="en-US" w:bidi="en-US"/>
+              </w:rPr>
+              <w:t>HE01 study</w:t>
+            </w:r>
+          </w:p>
+        </w:tc>
+        <w:tc>
+          <w:tcPr>
+            <w:tcW w:type="dxa" w:w="1400"/>
+          </w:tcPr>
+          <w:p>
+            <w:pPr>
+              <w:bidi w:val="0"/>
+              <w:jc w:val="both"/>
+              <w:ind w:left="0" w:right="0" w:firstLine="0" w:hanging="0"/>
+            </w:pPr>
+            <w:r/>
+            <w:r>
+              <w:rPr>
+                <w:rFonts w:ascii="Times New Roman" w:hAnsi="Times New Roman" w:cs="Times New Roman" w:eastAsia="Times New Roman"/>
+                <w:b w:val="0"/>
+                <w:i w:val="0"/>
+                <w:sz w:val="16"/>
+                <w:szCs w:val="16"/>
+                <w:lang w:val="en-US" w:bidi="en-US"/>
+              </w:rPr>
+              <w:t>d176f0ab</w:t>
+            </w:r>
+          </w:p>
+        </w:tc>
+        <w:tc>
+          <w:tcPr>
+            <w:tcW w:type="dxa" w:w="1800"/>
+          </w:tcPr>
+          <w:p>
+            <w:pPr>
+              <w:bidi w:val="0"/>
+              <w:jc w:val="both"/>
+              <w:ind w:left="0" w:right="0" w:firstLine="0" w:hanging="0"/>
+            </w:pPr>
+            <w:r/>
+            <w:r>
+              <w:rPr>
+                <w:rFonts w:ascii="Times New Roman" w:hAnsi="Times New Roman" w:cs="Times New Roman" w:eastAsia="Times New Roman"/>
+                <w:b w:val="0"/>
+                <w:i w:val="0"/>
+                <w:sz w:val="16"/>
+                <w:szCs w:val="16"/>
+                <w:lang w:val="en-US" w:bidi="en-US"/>
+              </w:rPr>
+              <w:t>Grade 4, ceiling empty</w:t>
+            </w:r>
+          </w:p>
+        </w:tc>
+      </w:tr>
+      <w:tr>
+        <w:tc>
+          <w:tcPr>
+            <w:tcW w:type="dxa" w:w="1400"/>
+          </w:tcPr>
+          <w:p>
+            <w:pPr>
+              <w:bidi w:val="0"/>
+              <w:jc w:val="both"/>
+              <w:ind w:left="0" w:right="0" w:firstLine="0" w:hanging="0"/>
+            </w:pPr>
+            <w:r/>
+            <w:r>
+              <w:rPr>
+                <w:rFonts w:ascii="Times New Roman" w:hAnsi="Times New Roman" w:cs="Times New Roman" w:eastAsia="Times New Roman"/>
+                <w:b w:val="0"/>
+                <w:i w:val="0"/>
+                <w:sz w:val="16"/>
+                <w:szCs w:val="16"/>
+                <w:lang w:val="en-US" w:bidi="en-US"/>
+              </w:rPr>
+              <w:t>Deletion grid</w:t>
+            </w:r>
+          </w:p>
+        </w:tc>
+        <w:tc>
+          <w:tcPr>
+            <w:tcW w:type="dxa" w:w="1400"/>
+          </w:tcPr>
+          <w:p>
+            <w:pPr>
+              <w:bidi w:val="0"/>
+              <w:jc w:val="both"/>
+              <w:ind w:left="0" w:right="0" w:firstLine="0" w:hanging="0"/>
+            </w:pPr>
+            <w:r/>
+            <w:r>
+              <w:rPr>
+                <w:rFonts w:ascii="Times New Roman" w:hAnsi="Times New Roman" w:cs="Times New Roman" w:eastAsia="Times New Roman"/>
+                <w:b w:val="0"/>
+                <w:i w:val="0"/>
+                <w:sz w:val="16"/>
+                <w:szCs w:val="16"/>
+                <w:lang w:val="en-US" w:bidi="en-US"/>
+              </w:rPr>
+              <w:t>3c8a8a1f</w:t>
+            </w:r>
+          </w:p>
+        </w:tc>
+        <w:tc>
+          <w:tcPr>
+            <w:tcW w:type="dxa" w:w="1800"/>
+          </w:tcPr>
+          <w:p>
+            <w:pPr>
+              <w:bidi w:val="0"/>
+              <w:jc w:val="both"/>
+              <w:ind w:left="0" w:right="0" w:firstLine="0" w:hanging="0"/>
+            </w:pPr>
+            <w:r/>
+            <w:r>
+              <w:rPr>
+                <w:rFonts w:ascii="Times New Roman" w:hAnsi="Times New Roman" w:cs="Times New Roman" w:eastAsia="Times New Roman"/>
+                <w:b w:val="0"/>
+                <w:i w:val="0"/>
+                <w:sz w:val="16"/>
+                <w:szCs w:val="16"/>
+                <w:lang w:val="en-US" w:bidi="en-US"/>
+              </w:rPr>
+              <w:t>Six deletions below 4</w:t>
+            </w:r>
+          </w:p>
+        </w:tc>
+      </w:tr>
+      <w:tr>
+        <w:tc>
+          <w:tcPr>
+            <w:tcW w:type="dxa" w:w="1400"/>
+          </w:tcPr>
+          <w:p>
+            <w:pPr>
+              <w:bidi w:val="0"/>
+              <w:jc w:val="both"/>
+              <w:ind w:left="0" w:right="0" w:firstLine="0" w:hanging="0"/>
+            </w:pPr>
+            <w:r/>
+            <w:r>
+              <w:rPr>
+                <w:rFonts w:ascii="Times New Roman" w:hAnsi="Times New Roman" w:cs="Times New Roman" w:eastAsia="Times New Roman"/>
+                <w:b w:val="0"/>
+                <w:i w:val="0"/>
+                <w:sz w:val="16"/>
+                <w:szCs w:val="16"/>
+                <w:lang w:val="en-US" w:bidi="en-US"/>
+              </w:rPr>
+              <w:t>Risk bar</w:t>
+            </w:r>
+          </w:p>
+        </w:tc>
+        <w:tc>
+          <w:tcPr>
+            <w:tcW w:type="dxa" w:w="1400"/>
+          </w:tcPr>
+          <w:p>
+            <w:pPr>
+              <w:bidi w:val="0"/>
+              <w:jc w:val="both"/>
+              <w:ind w:left="0" w:right="0" w:firstLine="0" w:hanging="0"/>
+            </w:pPr>
+            <w:r/>
+            <w:r>
+              <w:rPr>
+                <w:rFonts w:ascii="Times New Roman" w:hAnsi="Times New Roman" w:cs="Times New Roman" w:eastAsia="Times New Roman"/>
+                <w:b w:val="0"/>
+                <w:i w:val="0"/>
+                <w:sz w:val="16"/>
+                <w:szCs w:val="16"/>
+                <w:lang w:val="en-US" w:bidi="en-US"/>
+              </w:rPr>
+              <w:t>b053e7f1</w:t>
+            </w:r>
+          </w:p>
+        </w:tc>
+        <w:tc>
+          <w:tcPr>
+            <w:tcW w:type="dxa" w:w="1800"/>
+          </w:tcPr>
+          <w:p>
+            <w:pPr>
+              <w:bidi w:val="0"/>
+              <w:jc w:val="both"/>
+              <w:ind w:left="0" w:right="0" w:firstLine="0" w:hanging="0"/>
+            </w:pPr>
+            <w:r/>
+            <w:r>
+              <w:rPr>
+                <w:rFonts w:ascii="Times New Roman" w:hAnsi="Times New Roman" w:cs="Times New Roman" w:eastAsia="Times New Roman"/>
+                <w:b w:val="0"/>
+                <w:i w:val="0"/>
+                <w:sz w:val="16"/>
+                <w:szCs w:val="16"/>
+                <w:lang w:val="en-US" w:bidi="en-US"/>
+              </w:rPr>
+              <w:t>Met only if the row ran</w:t>
+            </w:r>
+          </w:p>
+        </w:tc>
+      </w:tr>
+    </w:tbl>
+    <w:p>
+      <w:pPr>
+        <w:bidi w:val="0"/>
+        <w:jc w:val="both"/>
+      </w:pPr>
+      <w:r>
+        <w:rPr>
+          <w:rFonts w:ascii="Times New Roman" w:hAnsi="Times New Roman" w:cs="Times New Roman" w:eastAsia="Times New Roman"/>
+          <w:b w:val="0"/>
+          <w:i w:val="0"/>
+          <w:sz w:val="20"/>
+          <w:szCs w:val="20"/>
+          <w:lang w:val="en-US" w:bidi="en-US"/>
+        </w:rPr>
+        <w:t>Hardware is a third profile on the same port, not a second engine. The ESP32 adapter is an engineering stub. It is implemented, and it is not one of the measurements above. No robot result is reported. A later measurement would use this auditor on that port.</w:t>
       </w:r>
     </w:p>
     <w:p>

</xml_diff>

<commit_message>
docs(baic): add the audit-path flowchart to the English manuscript
Figure 1 shows the profile, the bundle, the grade, and the risk bar.
The last arrow is dashed because the bar does not move the grade.
The manuscript stays at four pages.
</commit_message>
<xml_diff>
--- a/paper/baic/BAIC2026_Jamei_en.docx
+++ b/paper/baic/BAIC2026_Jamei_en.docx
@@ -199,6 +199,83 @@
           <w:lang w:val="en-US" w:bidi="en-US"/>
         </w:rPr>
         <w:t>The auditor, ClaimGate, is part of CodonTrace Genesis. The engine does not know a domain, and it was not rewritten for medicine. A domain profile names the port: artificial life, biomedical, or hardware. Records from Avida, a table from MABE2, and an Overview, Design concepts, and Details description are read through that port and are not the product of this paper. An ESP32 port is implemented and is not one of the measurements below. A configuration string that would claim an ASME V&amp;V 40 pass is rejected. This tool does not issue an ASME, FDA, or IEC certificate. Viceconti and colleagues set an in silico trial on context, risk, and a verification chain [5]. Here that chain becomes a grade on one file, not a certificate for a product.</w:t>
+      </w:r>
+    </w:p>
+    <w:p>
+      <w:pPr>
+        <w:bidi w:val="0"/>
+        <w:spacing w:before="0" w:after="0"/>
+        <w:jc w:val="center"/>
+      </w:pPr>
+      <w:r>
+        <w:drawing>
+          <wp:inline xmlns:a="http://schemas.openxmlformats.org/drawingml/2006/main" xmlns:pic="http://schemas.openxmlformats.org/drawingml/2006/picture">
+            <wp:extent cx="2788920" cy="1950720"/>
+            <wp:docPr id="1" name="Picture 1"/>
+            <wp:cNvGraphicFramePr>
+              <a:graphicFrameLocks noChangeAspect="1"/>
+            </wp:cNvGraphicFramePr>
+            <a:graphic>
+              <a:graphicData uri="http://schemas.openxmlformats.org/drawingml/2006/picture">
+                <pic:pic>
+                  <pic:nvPicPr>
+                    <pic:cNvPr id="0" name="audit_flow.png"/>
+                    <pic:cNvPicPr/>
+                  </pic:nvPicPr>
+                  <pic:blipFill>
+                    <a:blip r:embed="rId19"/>
+                    <a:stretch>
+                      <a:fillRect/>
+                    </a:stretch>
+                  </pic:blipFill>
+                  <pic:spPr>
+                    <a:xfrm>
+                      <a:off x="0" y="0"/>
+                      <a:ext cx="2788920" cy="1950720"/>
+                    </a:xfrm>
+                    <a:prstGeom prst="rect"/>
+                  </pic:spPr>
+                </pic:pic>
+              </a:graphicData>
+            </a:graphic>
+          </wp:inline>
+        </w:drawing>
+      </w:r>
+    </w:p>
+    <w:p>
+      <w:pPr>
+        <w:pStyle w:val="Caption"/>
+        <w:keepNext/>
+        <w:bidi w:val="0"/>
+        <w:jc w:val="center"/>
+      </w:pPr>
+      <w:r>
+        <w:rPr>
+          <w:rFonts w:ascii="Times New Roman" w:hAnsi="Times New Roman" w:cs="Times New Roman" w:eastAsia="Times New Roman"/>
+          <w:b/>
+          <w:i w:val="0"/>
+          <w:sz w:val="16"/>
+          <w:szCs w:val="16"/>
+          <w:lang w:val="en-US" w:bidi="en-US"/>
+        </w:rPr>
+        <w:t>Fig. 1. The grade is computed from the bundle. The risk bar reads declared risk and does not move that grade.</w:t>
+      </w:r>
+    </w:p>
+    <w:p>
+      <w:pPr>
+        <w:bidi w:val="0"/>
+        <w:jc w:val="both"/>
+      </w:pPr>
+      <w:r>
+        <w:rPr>
+          <w:rFonts w:ascii="Times New Roman" w:hAnsi="Times New Roman" w:cs="Times New Roman" w:eastAsia="Times New Roman"/>
+          <w:b w:val="0"/>
+          <w:i w:val="0"/>
+          <w:sz w:val="20"/>
+          <w:szCs w:val="20"/>
+          <w:lang w:val="en-US" w:bidi="en-US"/>
+        </w:rPr>
+        <w:t>Figure 1 is the path for every measurement below. Three profiles enter one auditor. The hardware profile is drawn because the port exists. It supplies none of the grades in the tables. The double box is not another grade. It answers only whether the evidence meets the declared risk.</w:t>
       </w:r>
     </w:p>
     <w:p>

</xml_diff>

<commit_message>
docs(baic): make the audit figure readable and add the grade chart
The column figure now includes the two recorded grades, 4 and 0.
Template images are left in the file. The manuscript stays at four pages.
</commit_message>
<xml_diff>
--- a/paper/baic/BAIC2026_Jamei_en.docx
+++ b/paper/baic/BAIC2026_Jamei_en.docx
@@ -210,8 +210,8 @@
       <w:r>
         <w:drawing>
           <wp:inline xmlns:a="http://schemas.openxmlformats.org/drawingml/2006/main" xmlns:pic="http://schemas.openxmlformats.org/drawingml/2006/picture">
-            <wp:extent cx="2788920" cy="1950720"/>
-            <wp:docPr id="1" name="Picture 1"/>
+            <wp:extent cx="2788920" cy="2437701"/>
+            <wp:docPr id="1" name="Figure 1" descr="Flow from domain profile to grade, then the two recorded grades: HE01 is 4 and the device table is 0."/>
             <wp:cNvGraphicFramePr>
               <a:graphicFrameLocks noChangeAspect="1"/>
             </wp:cNvGraphicFramePr>
@@ -231,7 +231,7 @@
                   <pic:spPr>
                     <a:xfrm>
                       <a:off x="0" y="0"/>
-                      <a:ext cx="2788920" cy="1950720"/>
+                      <a:ext cx="2788920" cy="2437701"/>
                     </a:xfrm>
                     <a:prstGeom prst="rect"/>
                   </pic:spPr>
@@ -258,7 +258,7 @@
           <w:szCs w:val="16"/>
           <w:lang w:val="en-US" w:bidi="en-US"/>
         </w:rPr>
-        <w:t>Fig. 1. The grade is computed from the bundle. The risk bar reads declared risk and does not move that grade.</w:t>
+        <w:t>Fig. 1. Path from the profile to the grade, and the two recorded grades. The risk bar does not move the grade.</w:t>
       </w:r>
     </w:p>
     <w:p>
@@ -275,7 +275,7 @@
           <w:szCs w:val="20"/>
           <w:lang w:val="en-US" w:bidi="en-US"/>
         </w:rPr>
-        <w:t>Figure 1 is the path for every measurement below. Three profiles enter one auditor. The hardware profile is drawn because the port exists. It supplies none of the grades in the tables. The double box is not another grade. It answers only whether the evidence meets the declared risk.</w:t>
+        <w:t>Figure 1 is the path for every measurement below. The lower panel repeats Table 3 as a chart: the executed campaign is grade 4 and the device score table is grade 0. A bar at zero is the result, not a missing drawing. The hardware profile is on the path because the port exists. It supplies none of these grades. The double box is not another grade.</w:t>
       </w:r>
     </w:p>
     <w:p>

</xml_diff>

<commit_message>
docs(baic): cite every named source and separate the two software archives
Avida, MABE 2.0, the ODD protocol, and Holm's correction are now
in the reference list. Version 0.3.0b6 and the earlier 0.3.0a2
archive are cited as different records. The manuscript stays at four pages.
</commit_message>
<xml_diff>
--- a/paper/baic/BAIC2026_Jamei_en.docx
+++ b/paper/baic/BAIC2026_Jamei_en.docx
@@ -198,7 +198,7 @@
           <w:szCs w:val="20"/>
           <w:lang w:val="en-US" w:bidi="en-US"/>
         </w:rPr>
-        <w:t>The auditor, ClaimGate, is part of CodonTrace Genesis. The engine does not know a domain, and it was not rewritten for medicine. A domain profile names the port: artificial life, biomedical, or hardware. Records from Avida, a table from MABE2, and an Overview, Design concepts, and Details description are read through that port and are not the product of this paper. An ESP32 port is implemented and is not one of the measurements below. A configuration string that would claim an ASME V&amp;V 40 pass is rejected. This tool does not issue an ASME, FDA, or IEC certificate. Viceconti and colleagues set an in silico trial on context, risk, and a verification chain [5]. Here that chain becomes a grade on one file, not a certificate for a product.</w:t>
+        <w:t>The auditor, ClaimGate, is part of CodonTrace Genesis. The engine does not know a domain, and it was not rewritten for medicine. A domain profile names the port: artificial life, biomedical, or hardware. Records from Avida [5], a table from MABE2 [6], and an Overview, Design concepts, and Details description [7] are read through that port and are not the product of this paper. An ESP32 port is implemented and is not one of the measurements below. A configuration string that would claim an ASME V&amp;V 40 pass is rejected. This tool does not issue an ASME, FDA, or IEC certificate. Viceconti and colleagues set an in silico trial on context, risk, and a verification chain [8]. Here that chain becomes a grade on one file, not a certificate for a product.</w:t>
       </w:r>
     </w:p>
     <w:p>
@@ -292,7 +292,7 @@
           <w:szCs w:val="20"/>
           <w:lang w:val="en-US" w:bidi="en-US"/>
         </w:rPr>
-        <w:t>MIRROR assembles a local evidence bundle for inspection before release and does not offer a regulatory guarantee [6]. NovaFabric records an agent run in a signed capsule [7]. The difference here is a grade computed from the conditions present in the bundle.</w:t>
+        <w:t>MIRROR assembles a local evidence bundle for inspection before release and does not offer a regulatory guarantee [9]. NovaFabric records an agent run in a signed capsule [10]. The difference here is a grade computed from the conditions present in the bundle.</w:t>
       </w:r>
     </w:p>
     <w:p>
@@ -685,7 +685,7 @@
           <w:szCs w:val="20"/>
           <w:lang w:val="en-US" w:bidi="en-US"/>
         </w:rPr>
-        <w:t>On a compared arm, more outcome rows than seeds void both the interval and the condition of 16 seeds. A subsample is not a new seed. The hash is taken from the file bytes and does not rewrite them. The default test is a sign-flip permutation with a Holm correction and a bias-corrected and accelerated interval, written BCa below. A studentized bootstrap is optional when there are at most 40 pairs.</w:t>
+        <w:t>On a compared arm, more outcome rows than seeds void both the interval and the condition of 16 seeds. A subsample is not a new seed. The hash is taken from the file bytes and does not rewrite them. The default test is a sign-flip permutation with a Holm correction [11] and a bias-corrected and accelerated interval, written BCa below. A studentized bootstrap is optional when there are at most 40 pairs.</w:t>
       </w:r>
     </w:p>
     <w:p>
@@ -720,7 +720,7 @@
           <w:szCs w:val="20"/>
           <w:lang w:val="en-US" w:bidi="en-US"/>
         </w:rPr>
-        <w:t>Regulatory words on this port are labels, not grades. ASME VVUQ 40.1-2026 is a worked tibial-tray example, not a pass bit [8]. IEC 62304 assigns software safety class A, B, or C [9]. The International Medical Device Regulators Forum document N12 sets categories I to IV for software as a medical device [10]. Recording a category does not classify a product. If the model is declared not physics-based, the port records that the 2023 guidance places a standalone model outside that scope. The note does not raise the ladder.</w:t>
+        <w:t>Regulatory words on this port are labels, not grades. ASME VVUQ 40.1-2026 is a worked tibial-tray example, not a pass bit [12]. IEC 62304 assigns software safety class A, B, or C [13]. The International Medical Device Regulators Forum document N12 sets categories I to IV for software as a medical device [14]. Recording a category does not classify a product. If the model is declared not physics-based, the port records that the 2023 guidance places a standalone model outside that scope. The note does not raise the ladder.</w:t>
       </w:r>
     </w:p>
     <w:p>
@@ -737,7 +737,7 @@
           <w:szCs w:val="20"/>
           <w:lang w:val="en-US" w:bidi="en-US"/>
         </w:rPr>
-        <w:t>Importance and knowledge are each scored on three levels, following Phenomena Identification and Ranking Table practice [11]. Table 2 is the gap rule on this port. It is not a result from the spent-fuel study in that report. High importance stays open unless knowledge is adequate and the row was measured. Medium importance is a gap only when knowledge is none. Low importance is screened out. A typed word, with no treatment arm, is not a measurement. On this port a coupled model does not rise above its weakest executed submodel. A submodel that is not identifiable cannot contribute above grade 1. Evidence limited to categories 2, 6, and 7 of the 2023 guidance, calibration, emergent behavior, and plausibility, cannot contribute above grade 2 [1]. If a submodel was not executed, that cap is not reported as a measurement and does not move the claim grade.</w:t>
+        <w:t>Importance and knowledge are each scored on three levels, following Phenomena Identification and Ranking Table practice [15]. Table 2 is the gap rule on this port. It is not a result from the spent-fuel study in that report. High importance stays open unless knowledge is adequate and the row was measured. Medium importance is a gap only when knowledge is none. Low importance is screened out. A typed word, with no treatment arm, is not a measurement. On this port a coupled model does not rise above its weakest executed submodel. A submodel that is not identifiable cannot contribute above grade 1. Evidence limited to categories 2, 6, and 7 of the 2023 guidance, calibration, emergent behavior, and plausibility, cannot contribute above grade 2 [1]. If a submodel was not executed, that cap is not reported as a measurement and does not move the claim grade.</w:t>
       </w:r>
     </w:p>
     <w:p>
@@ -1535,7 +1535,7 @@
           <w:szCs w:val="20"/>
           <w:lang w:val="en-US" w:bidi="en-US"/>
         </w:rPr>
-        <w:t>The negative control is a declared score table for a device model. The question was whether a size choice would be licensed. There is no ISO 14879-1 test and no implant. Model influence is 2 and decision consequence is 3. Treatment scores are 0.12, 0.11, and 0.13. Control scores are 0.20, 0.19, and 0.21. The declared labels are software in a medical device, class B of IEC 62304 [9], category II of IMDRF [10], and evidence categories 1, 3, and 8 of the 2023 guidance, with the model declared as physics-based. Replay is not verified, and the artifact manifest is among the conditions for leaving grade 0, so the grade is 0. That tibial-tray example is not run here [8]. Table 3 records the distance between the two controls.</w:t>
+        <w:t>The negative control is a declared score table for a device model. The question was whether a size choice would be licensed. There is no ISO 14879-1 test and no implant. Model influence is 2 and decision consequence is 3. Treatment scores are 0.12, 0.11, and 0.13. Control scores are 0.20, 0.19, and 0.21. The declared labels are software in a medical device, class B of IEC 62304 [13], category II of IMDRF [14], and evidence categories 1, 3, and 8 of the 2023 guidance, with the model declared as physics-based. Replay is not verified, and the artifact manifest is among the conditions for leaving grade 0, so the grade is 0. That tibial-tray example is not run here [12]. Table 3 records the distance between the two controls.</w:t>
       </w:r>
     </w:p>
     <w:p>
@@ -1889,7 +1889,7 @@
           <w:szCs w:val="20"/>
           <w:lang w:val="en-US" w:bidi="en-US"/>
         </w:rPr>
-        <w:t>Grade 5 on HE01 lacks only an archived artifact or a DOI for the campaign itself. The software identifier 10.5281/zenodo.20337435 is not counted as that archive, so the positive control stays at grade 4. On these two bundles, changing only declared metadata did not raise the grade. The fields tried were model influence, decision consequence, the software-in-a-device flag, the IEC and IMDRF labels, the FDA evidence categories, and the typed word adequate. Declaring that a model is not physics-based records the scope note in the 2023 guidance and still does not move the ladder.</w:t>
+        <w:t>Grade 5 on HE01 lacks only an archived artifact or a DOI for the campaign itself. The software identifier stored with that file, 10.5281/zenodo.20337435, is archive version 0.3.0a2 [18], not a DOI for the campaign, so the positive control stays at grade 4. On these two bundles, changing only declared metadata did not raise the grade. The fields tried were model influence, decision consequence, the software-in-a-device flag, the IEC and IMDRF labels, the FDA evidence categories, and the typed word adequate. Declaring that a model is not physics-based records the scope note in the 2023 guidance and still does not move the ladder.</w:t>
       </w:r>
     </w:p>
     <w:p>
@@ -2370,7 +2370,7 @@
           <w:szCs w:val="20"/>
           <w:lang w:val="en-US" w:bidi="en-US"/>
         </w:rPr>
-        <w:t>The unit of analysis is the seed, not a row of subsamples. If a compared arm has more values than seeds, the interval and the 16-seed condition both fail, and a pseudoreplication warning is stored [12]. HE01 has one value per seed and remains at grade 4.</w:t>
+        <w:t>The unit of analysis is the seed, not a row of subsamples. If a compared arm has more values than seeds, the interval and the 16-seed condition both fail, and a pseudoreplication warning is stored [17]. HE01 has one value per seed and remains at grade 4.</w:t>
       </w:r>
     </w:p>
     <w:p>
@@ -4188,7 +4188,7 @@
           <w:szCs w:val="20"/>
           <w:lang w:val="en-US" w:bidi="en-US"/>
         </w:rPr>
-        <w:t>A reader can repeat three files. Table 9 gives the fingerprint prefix of each. The auditor writes the file. The three files were committed at c8db778, and those digests are unchanged. Code is at github.com/Parvaz-Jamei/codontrace-genesis. The package identity is 0.3.0b7 and is not a PyPI release. The published tip is 0.3.0b6. The DOI 10.5281/zenodo.20337435 archives the software, not the campaign.</w:t>
+        <w:t>A reader can repeat three files. Table 9 gives the fingerprint prefix of each. The auditor writes the file. The three files were committed at c8db778, and those digests are unchanged. Code is at github.com/Parvaz-Jamei/codontrace-genesis. The package identity is 0.3.0b7 and is not a PyPI release. The published tip is 0.3.0b6 [16]. The identifier 10.5281/zenodo.20337435 is the earlier archive named above, not the campaign.</w:t>
       </w:r>
     </w:p>
     <w:p>
@@ -4686,6 +4686,60 @@
           <w:szCs w:val="16"/>
           <w:lang w:val="en-US" w:bidi="en-US"/>
         </w:rPr>
+        <w:t>C. Ofria and C. O. Wilke, “Avida: a software platform for research in computational evolutionary biology,” Artificial Life, vol. 10, no. 2, pp. 191-229, 2004, doi: 10.1162/106454604773563612.</w:t>
+      </w:r>
+    </w:p>
+    <w:p>
+      <w:pPr>
+        <w:pStyle w:val="References"/>
+        <w:bidi w:val="0"/>
+        <w:jc w:val="both"/>
+      </w:pPr>
+      <w:r>
+        <w:rPr>
+          <w:rFonts w:ascii="Times New Roman" w:hAnsi="Times New Roman" w:cs="Times New Roman" w:eastAsia="Times New Roman"/>
+          <w:b w:val="0"/>
+          <w:i w:val="0"/>
+          <w:sz w:val="16"/>
+          <w:szCs w:val="16"/>
+          <w:lang w:val="en-US" w:bidi="en-US"/>
+        </w:rPr>
+        <w:t>C. Bohm, A. Lalejini, J. Schossau, and C. Ofria, “MABE 2.0: an introduction to MABE and a road map for the future of MABE development,” in Proc. Genetic and Evolutionary Computation Conf. Companion, Prague, Czech Republic, Jul. 2019, pp. 1349-1356, doi: 10.1145/3319619.3326825.</w:t>
+      </w:r>
+    </w:p>
+    <w:p>
+      <w:pPr>
+        <w:pStyle w:val="References"/>
+        <w:bidi w:val="0"/>
+        <w:jc w:val="both"/>
+      </w:pPr>
+      <w:r>
+        <w:rPr>
+          <w:rFonts w:ascii="Times New Roman" w:hAnsi="Times New Roman" w:cs="Times New Roman" w:eastAsia="Times New Roman"/>
+          <w:b w:val="0"/>
+          <w:i w:val="0"/>
+          <w:sz w:val="16"/>
+          <w:szCs w:val="16"/>
+          <w:lang w:val="en-US" w:bidi="en-US"/>
+        </w:rPr>
+        <w:t>V. Grimm, S. F. Railsback, C. E. Vincenot, et al., “The ODD protocol for describing agent-based and other simulation models: A second update to improve clarity, replication, and structural realism,” J. Artif. Soc. Social Simul., vol. 23, no. 2, Art. no. 7, 2020, doi: 10.18564/jasss.4259.</w:t>
+      </w:r>
+    </w:p>
+    <w:p>
+      <w:pPr>
+        <w:pStyle w:val="References"/>
+        <w:bidi w:val="0"/>
+        <w:jc w:val="both"/>
+      </w:pPr>
+      <w:r>
+        <w:rPr>
+          <w:rFonts w:ascii="Times New Roman" w:hAnsi="Times New Roman" w:cs="Times New Roman" w:eastAsia="Times New Roman"/>
+          <w:b w:val="0"/>
+          <w:i w:val="0"/>
+          <w:sz w:val="16"/>
+          <w:szCs w:val="16"/>
+          <w:lang w:val="en-US" w:bidi="en-US"/>
+        </w:rPr>
         <w:t>M. Viceconti, F. Pappalardo, B. Rodriguez, M. Horner, J. Bischoff, and F. Musuamba Tshinanu, “In silico trials: verification, validation and uncertainty quantification of predictive models used in the regulatory evaluation of biomedical products,” Methods, vol. 185, pp. 120-127, Jan. 2021, doi: 10.1016/j.ymeth.2020.01.011.</w:t>
       </w:r>
     </w:p>
@@ -4740,6 +4794,24 @@
           <w:szCs w:val="16"/>
           <w:lang w:val="en-US" w:bidi="en-US"/>
         </w:rPr>
+        <w:t>S. Holm, “A simple sequentially rejective multiple test procedure,” Scandinavian J. Statistics, vol. 6, no. 2, pp. 65-70, 1979.</w:t>
+      </w:r>
+    </w:p>
+    <w:p>
+      <w:pPr>
+        <w:pStyle w:val="References"/>
+        <w:bidi w:val="0"/>
+        <w:jc w:val="both"/>
+      </w:pPr>
+      <w:r>
+        <w:rPr>
+          <w:rFonts w:ascii="Times New Roman" w:hAnsi="Times New Roman" w:cs="Times New Roman" w:eastAsia="Times New Roman"/>
+          <w:b w:val="0"/>
+          <w:i w:val="0"/>
+          <w:sz w:val="16"/>
+          <w:szCs w:val="16"/>
+          <w:lang w:val="en-US" w:bidi="en-US"/>
+        </w:rPr>
         <w:t>An Example of Assessing Computational Model Credibility Using the ASME V&amp;V 40 Risk-Based Framework: Tibial Tray Component Worst-Case Size Identification for Fatigue Testing, ASME VVUQ 40.1-2026. New York: ASME, 2026.</w:t>
       </w:r>
     </w:p>
@@ -4812,7 +4884,43 @@
           <w:szCs w:val="16"/>
           <w:lang w:val="en-US" w:bidi="en-US"/>
         </w:rPr>
+        <w:t>P. Jamei, “CodonTrace Genesis,” version 0.3.0b6, Zenodo, Sep. 18, 2026, doi: 10.5281/zenodo.22822919.</w:t>
+      </w:r>
+    </w:p>
+    <w:p>
+      <w:pPr>
+        <w:pStyle w:val="References"/>
+        <w:bidi w:val="0"/>
+        <w:jc w:val="both"/>
+      </w:pPr>
+      <w:r>
+        <w:rPr>
+          <w:rFonts w:ascii="Times New Roman" w:hAnsi="Times New Roman" w:cs="Times New Roman" w:eastAsia="Times New Roman"/>
+          <w:b w:val="0"/>
+          <w:i w:val="0"/>
+          <w:sz w:val="16"/>
+          <w:szCs w:val="16"/>
+          <w:lang w:val="en-US" w:bidi="en-US"/>
+        </w:rPr>
         <w:t>S. H. Hurlbert, “Pseudoreplication and the design of ecological field experiments,” Ecological Monographs, vol. 54, no. 2, pp. 187-211, 1984, doi: 10.2307/1942661.</w:t>
+      </w:r>
+    </w:p>
+    <w:p>
+      <w:pPr>
+        <w:pStyle w:val="References"/>
+        <w:bidi w:val="0"/>
+        <w:jc w:val="both"/>
+      </w:pPr>
+      <w:r>
+        <w:rPr>
+          <w:rFonts w:ascii="Times New Roman" w:hAnsi="Times New Roman" w:cs="Times New Roman" w:eastAsia="Times New Roman"/>
+          <w:b w:val="0"/>
+          <w:i w:val="0"/>
+          <w:sz w:val="16"/>
+          <w:szCs w:val="16"/>
+          <w:lang w:val="en-US" w:bidi="en-US"/>
+        </w:rPr>
+        <w:t>P. Jamei, “CodonTrace Genesis,” version 0.3.0a2, Zenodo, May 22, 2026, doi: 10.5281/zenodo.20337435.</w:t>
       </w:r>
     </w:p>
     <w:sectPr>

</xml_diff>